<commit_message>
update Capstone Project resource with new project details, testing credentials, and enhanced requirements
</commit_message>
<xml_diff>
--- a/17. Regular Exam/resources/Full-Stack-Apps-with-AI-Capstone-Project.docx
+++ b/17. Regular Exam/resources/Full-Stack-Apps-with-AI-Capstone-Project.docx
@@ -200,9 +200,17 @@
             <w:vAlign w:val="center"/>
           </w:tcPr>
           <w:p>
-            <w:r>
-              <w:t>https://github.com/Martin322s/ai-full-stack-apps-final-project.git</w:t>
-            </w:r>
+            <w:pPr>
+              <w:jc w:val="both"/>
+            </w:pPr>
+            <w:hyperlink r:id="rId8" w:history="1">
+              <w:r>
+                <w:rPr>
+                  <w:rStyle w:val="a9"/>
+                </w:rPr>
+                <w:t>https://github.com/Martin322s/fit-life-project.git</w:t>
+              </w:r>
+            </w:hyperlink>
           </w:p>
         </w:tc>
       </w:tr>
@@ -227,9 +235,21 @@
             <w:vAlign w:val="center"/>
           </w:tcPr>
           <w:p>
-            <w:r>
-              <w:t>…</w:t>
-            </w:r>
+            <w:pPr>
+              <w:rPr>
+                <w:lang w:val="bg-BG"/>
+              </w:rPr>
+            </w:pPr>
+            <w:hyperlink r:id="rId9" w:history="1">
+              <w:r>
+                <w:rPr>
+                  <w:rStyle w:val="a9"/>
+                </w:rPr>
+                <w:t>https://fitlife-com.netlify.app/</w:t>
+              </w:r>
+            </w:hyperlink>
+            <w:bookmarkStart w:id="1" w:name="_GoBack"/>
+            <w:bookmarkEnd w:id="1"/>
           </w:p>
         </w:tc>
       </w:tr>
@@ -244,10 +264,16 @@
           </w:tcPr>
           <w:p>
             <w:r>
-              <w:t xml:space="preserve">Sample </w:t>
-            </w:r>
-            <w:r>
-              <w:t>credentials (</w:t>
+              <w:t>C</w:t>
+            </w:r>
+            <w:r>
+              <w:t xml:space="preserve">redentials </w:t>
+            </w:r>
+            <w:r>
+              <w:t xml:space="preserve">for testing </w:t>
+            </w:r>
+            <w:r>
+              <w:t>(</w:t>
             </w:r>
             <w:r>
               <w:t xml:space="preserve">login </w:t>
@@ -259,7 +285,7 @@
               <w:t xml:space="preserve"> pass</w:t>
             </w:r>
             <w:r>
-              <w:t>) for testing</w:t>
+              <w:t>)</w:t>
             </w:r>
           </w:p>
         </w:tc>
@@ -270,14 +296,70 @@
           </w:tcPr>
           <w:p>
             <w:r>
-              <w:t>…</w:t>
-            </w:r>
-            <w:bookmarkStart w:id="1" w:name="_GoBack"/>
-            <w:bookmarkEnd w:id="1"/>
+              <w:t xml:space="preserve">Email: </w:t>
+            </w:r>
+            <w:hyperlink r:id="rId10" w:history="1">
+              <w:r>
+                <w:rPr>
+                  <w:rStyle w:val="a9"/>
+                </w:rPr>
+                <w:t>peter@abv.bg</w:t>
+              </w:r>
+            </w:hyperlink>
+            <w:r>
+              <w:t xml:space="preserve"> Password: asd123asd</w:t>
+            </w:r>
+          </w:p>
+          <w:p>
+            <w:r>
+              <w:t xml:space="preserve">Admin Email: </w:t>
+            </w:r>
+            <w:hyperlink r:id="rId11" w:history="1">
+              <w:r>
+                <w:rPr>
+                  <w:rStyle w:val="a9"/>
+                </w:rPr>
+                <w:t>admin@fitlife.bg</w:t>
+              </w:r>
+            </w:hyperlink>
+            <w:r>
+              <w:t xml:space="preserve"> Admin Password: admin1234</w:t>
+            </w:r>
+          </w:p>
+          <w:p>
+            <w:r>
+              <w:rPr>
+                <w:rStyle w:val="ab"/>
+              </w:rPr>
+              <w:t>Bonus:</w:t>
+            </w:r>
+            <w:r>
+              <w:t xml:space="preserve"> The “Forgot Password” functionality works with real email delivery. To test it properly, you need to register or use an existing/accessible email address in order to receive the password reset link.</w:t>
+            </w:r>
           </w:p>
         </w:tc>
       </w:tr>
     </w:tbl>
+    <w:p>
+      <w:r>
+        <w:t xml:space="preserve">* If you have a good reason to </w:t>
+      </w:r>
+      <w:r>
+        <w:t>keep your codebase or app private</w:t>
+      </w:r>
+      <w:r>
+        <w:t>, contact the training team</w:t>
+      </w:r>
+      <w:r>
+        <w:rPr>
+          <w:lang w:val="bg-BG"/>
+        </w:rPr>
+        <w:t xml:space="preserve"> </w:t>
+      </w:r>
+      <w:r>
+        <w:t>for instructions.</w:t>
+      </w:r>
+    </w:p>
     <w:p>
       <w:pPr>
         <w:pStyle w:val="2"/>
@@ -464,7 +546,13 @@
         <w:t xml:space="preserve">project planner, </w:t>
       </w:r>
       <w:r>
-        <w:t>poll system, meme generator.</w:t>
+        <w:t xml:space="preserve">poll system, </w:t>
+      </w:r>
+      <w:r>
+        <w:t xml:space="preserve">e-commerce platform, health tracker, </w:t>
+      </w:r>
+      <w:r>
+        <w:t>meme generator.</w:t>
       </w:r>
     </w:p>
     <w:p>
@@ -643,7 +731,7 @@
         <w:t xml:space="preserve"> backend, communicating via </w:t>
       </w:r>
       <w:r>
-        <w:t>RESTful API</w:t>
+        <w:t>Server Actions</w:t>
       </w:r>
       <w:r>
         <w:t>.</w:t>
@@ -658,13 +746,13 @@
         </w:numPr>
       </w:pPr>
       <w:r>
-        <w:t>React</w:t>
+        <w:t>React Native (Expo)</w:t>
       </w:r>
       <w:r>
         <w:t xml:space="preserve"> </w:t>
       </w:r>
       <w:r>
-        <w:t xml:space="preserve">Native mobile client </w:t>
+        <w:t xml:space="preserve">mobile client </w:t>
       </w:r>
       <w:r>
         <w:t xml:space="preserve">with </w:t>
@@ -806,10 +894,136 @@
           <w:b/>
           <w:bCs/>
         </w:rPr>
-        <w:t>5 app screens</w:t>
-      </w:r>
-      <w:r>
-        <w:t xml:space="preserve"> (pages / popups / others).</w:t>
+        <w:t>10</w:t>
+      </w:r>
+      <w:r>
+        <w:rPr>
+          <w:b/>
+          <w:bCs/>
+        </w:rPr>
+        <w:t xml:space="preserve"> app screens</w:t>
+      </w:r>
+      <w:r>
+        <w:t xml:space="preserve"> (pages / popups / others)</w:t>
+      </w:r>
+      <w:r>
+        <w:t xml:space="preserve"> in the Web app</w:t>
+      </w:r>
+      <w:r>
+        <w:t>.</w:t>
+      </w:r>
+    </w:p>
+    <w:p>
+      <w:pPr>
+        <w:pStyle w:val="ac"/>
+        <w:numPr>
+          <w:ilvl w:val="1"/>
+          <w:numId w:val="3"/>
+        </w:numPr>
+      </w:pPr>
+      <w:r>
+        <w:lastRenderedPageBreak/>
+        <w:t>Example</w:t>
+      </w:r>
+      <w:r>
+        <w:t>s</w:t>
+      </w:r>
+      <w:r>
+        <w:t xml:space="preserve">: register, login, main </w:t>
+      </w:r>
+      <w:r>
+        <w:t>page</w:t>
+      </w:r>
+      <w:r>
+        <w:t xml:space="preserve">, </w:t>
+      </w:r>
+      <w:r>
+        <w:t>view details page, about page, user dashboard (</w:t>
+      </w:r>
+      <w:r>
+        <w:t xml:space="preserve">view / add / edit / delete </w:t>
+      </w:r>
+      <w:r>
+        <w:t>entity</w:t>
+      </w:r>
+      <w:r>
+        <w:t>)</w:t>
+      </w:r>
+      <w:r>
+        <w:t>, admin panel.</w:t>
+      </w:r>
+    </w:p>
+    <w:p>
+      <w:pPr>
+        <w:pStyle w:val="ac"/>
+        <w:numPr>
+          <w:ilvl w:val="1"/>
+          <w:numId w:val="3"/>
+        </w:numPr>
+      </w:pPr>
+      <w:r>
+        <w:t xml:space="preserve">Implement </w:t>
+      </w:r>
+      <w:r>
+        <w:rPr>
+          <w:b/>
+          <w:bCs/>
+        </w:rPr>
+        <w:t>responsive design</w:t>
+      </w:r>
+      <w:r>
+        <w:t xml:space="preserve"> for desktop and mobile browsers.</w:t>
+      </w:r>
+    </w:p>
+    <w:p>
+      <w:pPr>
+        <w:pStyle w:val="ac"/>
+        <w:numPr>
+          <w:ilvl w:val="1"/>
+          <w:numId w:val="3"/>
+        </w:numPr>
+      </w:pPr>
+      <w:r>
+        <w:t xml:space="preserve">Use </w:t>
+      </w:r>
+      <w:r>
+        <w:rPr>
+          <w:b/>
+          <w:bCs/>
+        </w:rPr>
+        <w:t>icons</w:t>
+      </w:r>
+      <w:r>
+        <w:t xml:space="preserve">, </w:t>
+      </w:r>
+      <w:r>
+        <w:rPr>
+          <w:b/>
+          <w:bCs/>
+        </w:rPr>
+        <w:t>effects</w:t>
+      </w:r>
+      <w:r>
+        <w:t xml:space="preserve"> and </w:t>
+      </w:r>
+      <w:r>
+        <w:rPr>
+          <w:b/>
+          <w:bCs/>
+        </w:rPr>
+        <w:t>visual cues</w:t>
+      </w:r>
+      <w:r>
+        <w:t xml:space="preserve"> to enhance user experience and make the </w:t>
+      </w:r>
+      <w:r>
+        <w:t>UI more</w:t>
+      </w:r>
+      <w:r>
+        <w:t xml:space="preserve"> intuitive</w:t>
+      </w:r>
+      <w:r>
+        <w:t>.</w:t>
       </w:r>
     </w:p>
     <w:p>
@@ -821,19 +1035,53 @@
         </w:numPr>
       </w:pPr>
       <w:r>
-        <w:t xml:space="preserve">Example: register, login, main </w:t>
-      </w:r>
-      <w:r>
-        <w:t>page</w:t>
-      </w:r>
-      <w:r>
-        <w:t xml:space="preserve">, view / add / edit / delete </w:t>
-      </w:r>
-      <w:r>
-        <w:t>entity</w:t>
-      </w:r>
-      <w:r>
-        <w:t>, admin panel.</w:t>
+        <w:t xml:space="preserve">Implement </w:t>
+      </w:r>
+      <w:r>
+        <w:rPr>
+          <w:b/>
+          <w:bCs/>
+        </w:rPr>
+        <w:t xml:space="preserve">minimum </w:t>
+      </w:r>
+      <w:r>
+        <w:rPr>
+          <w:b/>
+          <w:bCs/>
+        </w:rPr>
+        <w:t>5</w:t>
+      </w:r>
+      <w:r>
+        <w:rPr>
+          <w:b/>
+          <w:bCs/>
+        </w:rPr>
+        <w:t xml:space="preserve"> app screens</w:t>
+      </w:r>
+      <w:r>
+        <w:t xml:space="preserve"> (pages / popups / others) in the mobile app.</w:t>
+      </w:r>
+    </w:p>
+    <w:p>
+      <w:pPr>
+        <w:pStyle w:val="ac"/>
+        <w:numPr>
+          <w:ilvl w:val="1"/>
+          <w:numId w:val="3"/>
+        </w:numPr>
+      </w:pPr>
+      <w:r>
+        <w:t xml:space="preserve">Implement </w:t>
+      </w:r>
+      <w:r>
+        <w:rPr>
+          <w:b/>
+          <w:bCs/>
+        </w:rPr>
+        <w:t>responsive layout</w:t>
+      </w:r>
+      <w:r>
+        <w:t xml:space="preserve"> for smartphones (small screens) and tablets (large screens).</w:t>
       </w:r>
     </w:p>
     <w:p>
@@ -845,79 +1093,6 @@
         </w:numPr>
       </w:pPr>
       <w:r>
-        <w:t xml:space="preserve">Implement </w:t>
-      </w:r>
-      <w:r>
-        <w:rPr>
-          <w:b/>
-          <w:bCs/>
-        </w:rPr>
-        <w:t>responsive design</w:t>
-      </w:r>
-      <w:r>
-        <w:t xml:space="preserve"> for desktop and mobile browsers.</w:t>
-      </w:r>
-    </w:p>
-    <w:p>
-      <w:pPr>
-        <w:pStyle w:val="ac"/>
-        <w:numPr>
-          <w:ilvl w:val="0"/>
-          <w:numId w:val="3"/>
-        </w:numPr>
-      </w:pPr>
-      <w:r>
-        <w:t xml:space="preserve">Use </w:t>
-      </w:r>
-      <w:r>
-        <w:rPr>
-          <w:b/>
-          <w:bCs/>
-        </w:rPr>
-        <w:t>icons</w:t>
-      </w:r>
-      <w:r>
-        <w:t xml:space="preserve">, </w:t>
-      </w:r>
-      <w:r>
-        <w:rPr>
-          <w:b/>
-          <w:bCs/>
-        </w:rPr>
-        <w:t>effects</w:t>
-      </w:r>
-      <w:r>
-        <w:t xml:space="preserve"> and </w:t>
-      </w:r>
-      <w:r>
-        <w:rPr>
-          <w:b/>
-          <w:bCs/>
-        </w:rPr>
-        <w:t>visual cues</w:t>
-      </w:r>
-      <w:r>
-        <w:t xml:space="preserve"> to enhance user experience and make the </w:t>
-      </w:r>
-      <w:r>
-        <w:t>UI more</w:t>
-      </w:r>
-      <w:r>
-        <w:t xml:space="preserve"> intuitive</w:t>
-      </w:r>
-      <w:r>
-        <w:t>.</w:t>
-      </w:r>
-    </w:p>
-    <w:p>
-      <w:pPr>
-        <w:pStyle w:val="ac"/>
-        <w:numPr>
-          <w:ilvl w:val="0"/>
-          <w:numId w:val="3"/>
-        </w:numPr>
-      </w:pPr>
-      <w:r>
         <w:t>Place</w:t>
       </w:r>
       <w:r>
@@ -938,7 +1113,13 @@
         <w:t>components</w:t>
       </w:r>
       <w:r>
-        <w:t xml:space="preserve"> (for better maintenance).</w:t>
+        <w:t xml:space="preserve"> (for </w:t>
+      </w:r>
+      <w:r>
+        <w:t>easier</w:t>
+      </w:r>
+      <w:r>
+        <w:t xml:space="preserve"> maintenance).</w:t>
       </w:r>
     </w:p>
     <w:p>
@@ -946,7 +1127,6 @@
         <w:pStyle w:val="3"/>
       </w:pPr>
       <w:r>
-        <w:lastRenderedPageBreak/>
         <w:t>Backend</w:t>
       </w:r>
     </w:p>
@@ -1040,6 +1220,9 @@
         <w:t>)</w:t>
       </w:r>
       <w:r>
+        <w:t>, accessed</w:t>
+      </w:r>
+      <w:r>
         <w:t xml:space="preserve"> </w:t>
       </w:r>
       <w:r>
@@ -1091,7 +1274,34 @@
         <w:t>authentication</w:t>
       </w:r>
       <w:r>
-        <w:t xml:space="preserve"> (users, register, login, logout).</w:t>
+        <w:t xml:space="preserve"> (register, login, logout)</w:t>
+      </w:r>
+      <w:r>
+        <w:t xml:space="preserve">, </w:t>
+      </w:r>
+      <w:r>
+        <w:rPr>
+          <w:b/>
+          <w:bCs/>
+        </w:rPr>
+        <w:t>hash passwords</w:t>
+      </w:r>
+      <w:r>
+        <w:t xml:space="preserve"> in the DB (e.g. with `</w:t>
+      </w:r>
+      <w:r>
+        <w:rPr>
+          <w:b/>
+          <w:bCs/>
+          <w:noProof/>
+        </w:rPr>
+        <w:t>bcrypt</w:t>
+      </w:r>
+      <w:r>
+        <w:t>`)</w:t>
+      </w:r>
+      <w:r>
+        <w:t>.</w:t>
       </w:r>
     </w:p>
     <w:p>
@@ -1141,24 +1351,27 @@
         <w:t xml:space="preserve"> </w:t>
       </w:r>
       <w:r>
-        <w:t>photos and files</w:t>
+        <w:rPr>
+          <w:b/>
+          <w:bCs/>
+        </w:rPr>
+        <w:t>photos</w:t>
+      </w:r>
+      <w:r>
+        <w:t xml:space="preserve"> and </w:t>
+      </w:r>
+      <w:r>
+        <w:rPr>
+          <w:b/>
+          <w:bCs/>
+        </w:rPr>
+        <w:t>files</w:t>
       </w:r>
       <w:r>
         <w:t xml:space="preserve"> at the server-side</w:t>
       </w:r>
       <w:r>
         <w:t>.</w:t>
-      </w:r>
-    </w:p>
-    <w:p>
-      <w:pPr>
-        <w:pStyle w:val="3"/>
-      </w:pPr>
-      <w:r>
-        <w:t>Authentication</w:t>
-      </w:r>
-      <w:r>
-        <w:t xml:space="preserve"> and Authorization</w:t>
       </w:r>
     </w:p>
     <w:p>
@@ -1170,37 +1383,54 @@
         </w:numPr>
       </w:pPr>
       <w:r>
-        <w:t xml:space="preserve">Use </w:t>
-      </w:r>
-      <w:r>
-        <w:rPr>
-          <w:b/>
-          <w:bCs/>
-        </w:rPr>
-        <w:t>JWT tokens</w:t>
-      </w:r>
-      <w:r>
-        <w:rPr>
-          <w:b/>
-          <w:bCs/>
-        </w:rPr>
+        <w:t xml:space="preserve">Structure app logic as </w:t>
+      </w:r>
+      <w:r>
+        <w:rPr>
+          <w:b/>
+          <w:bCs/>
+        </w:rPr>
+        <w:t>services</w:t>
+      </w:r>
+      <w:r>
+        <w:t xml:space="preserve">, exposed through a </w:t>
+      </w:r>
+      <w:r>
+        <w:rPr>
+          <w:b/>
+          <w:bCs/>
+        </w:rPr>
+        <w:t xml:space="preserve">RESTful API </w:t>
+      </w:r>
+      <w:r>
+        <w:t>and</w:t>
+      </w:r>
+      <w:r>
+        <w:t xml:space="preserve"> consumed by</w:t>
+      </w:r>
+      <w:r>
         <w:t xml:space="preserve"> </w:t>
       </w:r>
       <w:r>
-        <w:t>for authentication and authorization</w:t>
-      </w:r>
-      <w:r>
-        <w:t xml:space="preserve">, with custom code or specialized library like </w:t>
-      </w:r>
-      <w:r>
-        <w:rPr>
-          <w:b/>
-          <w:bCs/>
-        </w:rPr>
-        <w:t>Auth.js</w:t>
+        <w:rPr>
+          <w:b/>
+          <w:bCs/>
+        </w:rPr>
+        <w:t>Next.js Server Components</w:t>
       </w:r>
       <w:r>
         <w:t>.</w:t>
+      </w:r>
+    </w:p>
+    <w:p>
+      <w:pPr>
+        <w:pStyle w:val="3"/>
+      </w:pPr>
+      <w:r>
+        <w:t>Authentication</w:t>
+      </w:r>
+      <w:r>
+        <w:t xml:space="preserve"> and Authorization</w:t>
       </w:r>
     </w:p>
     <w:p>
@@ -1212,36 +1442,34 @@
         </w:numPr>
       </w:pPr>
       <w:r>
-        <w:t xml:space="preserve">Implement </w:t>
-      </w:r>
-      <w:r>
-        <w:rPr>
-          <w:b/>
-          <w:bCs/>
-        </w:rPr>
-        <w:t>users</w:t>
-      </w:r>
-      <w:r>
-        <w:t xml:space="preserve"> (register, login, logout</w:t>
-      </w:r>
-      <w:r>
-        <w:t>)</w:t>
-      </w:r>
-      <w:r>
-        <w:t xml:space="preserve"> and </w:t>
-      </w:r>
-      <w:r>
-        <w:rPr>
-          <w:b/>
-          <w:bCs/>
-        </w:rPr>
-        <w:t>roles</w:t>
-      </w:r>
-      <w:r>
-        <w:t xml:space="preserve"> (normal and </w:t>
-      </w:r>
-      <w:r>
-        <w:t>admin users)</w:t>
+        <w:t xml:space="preserve">Use </w:t>
+      </w:r>
+      <w:r>
+        <w:rPr>
+          <w:b/>
+          <w:bCs/>
+        </w:rPr>
+        <w:t>JWT tokens</w:t>
+      </w:r>
+      <w:r>
+        <w:rPr>
+          <w:b/>
+          <w:bCs/>
+        </w:rPr>
+        <w:t xml:space="preserve"> </w:t>
+      </w:r>
+      <w:r>
+        <w:t>for authentication and authorization</w:t>
+      </w:r>
+      <w:r>
+        <w:t xml:space="preserve">, with custom code or specialized library like </w:t>
+      </w:r>
+      <w:r>
+        <w:rPr>
+          <w:b/>
+          <w:bCs/>
+        </w:rPr>
+        <w:t>Auth.js</w:t>
       </w:r>
       <w:r>
         <w:t>.</w:t>
@@ -1263,16 +1491,35 @@
           <w:b/>
           <w:bCs/>
         </w:rPr>
-        <w:t>access control</w:t>
-      </w:r>
-      <w:r>
-        <w:t xml:space="preserve"> using </w:t>
-      </w:r>
-      <w:r>
-        <w:t>custom code in your API endpoints</w:t>
-      </w:r>
-      <w:r>
-        <w:t xml:space="preserve"> and server-side components</w:t>
+        <w:t>users</w:t>
+      </w:r>
+      <w:r>
+        <w:t xml:space="preserve"> (register, login, logout</w:t>
+      </w:r>
+      <w:r>
+        <w:t>)</w:t>
+      </w:r>
+      <w:r>
+        <w:t xml:space="preserve"> and </w:t>
+      </w:r>
+      <w:r>
+        <w:rPr>
+          <w:b/>
+          <w:bCs/>
+        </w:rPr>
+        <w:t>roles</w:t>
+      </w:r>
+      <w:r>
+        <w:t xml:space="preserve"> (</w:t>
+      </w:r>
+      <w:r>
+        <w:t>e.g. regular</w:t>
+      </w:r>
+      <w:r>
+        <w:t xml:space="preserve"> and </w:t>
+      </w:r>
+      <w:r>
+        <w:t>admin users)</w:t>
       </w:r>
       <w:r>
         <w:t>.</w:t>
@@ -1287,6 +1534,98 @@
         </w:numPr>
       </w:pPr>
       <w:r>
+        <w:t xml:space="preserve">Store user </w:t>
+      </w:r>
+      <w:r>
+        <w:rPr>
+          <w:b/>
+          <w:bCs/>
+        </w:rPr>
+        <w:t>passwords</w:t>
+      </w:r>
+      <w:r>
+        <w:t xml:space="preserve"> in the </w:t>
+      </w:r>
+      <w:r>
+        <w:t>DB</w:t>
+      </w:r>
+      <w:r>
+        <w:t xml:space="preserve"> using secure </w:t>
+      </w:r>
+      <w:r>
+        <w:rPr>
+          <w:b/>
+          <w:bCs/>
+        </w:rPr>
+        <w:t>one-way hashing</w:t>
+      </w:r>
+      <w:r>
+        <w:t xml:space="preserve"> algorithms such as </w:t>
+      </w:r>
+      <w:r>
+        <w:rPr>
+          <w:b/>
+          <w:bCs/>
+        </w:rPr>
+        <w:t>bcrypt</w:t>
+      </w:r>
+      <w:r>
+        <w:t xml:space="preserve"> or </w:t>
+      </w:r>
+      <w:r>
+        <w:rPr>
+          <w:b/>
+          <w:bCs/>
+        </w:rPr>
+        <w:t>argon2</w:t>
+      </w:r>
+      <w:r>
+        <w:t>.</w:t>
+      </w:r>
+    </w:p>
+    <w:p>
+      <w:pPr>
+        <w:pStyle w:val="ac"/>
+        <w:numPr>
+          <w:ilvl w:val="0"/>
+          <w:numId w:val="4"/>
+        </w:numPr>
+      </w:pPr>
+      <w:r>
+        <w:t xml:space="preserve">Enforce </w:t>
+      </w:r>
+      <w:r>
+        <w:rPr>
+          <w:b/>
+          <w:bCs/>
+        </w:rPr>
+        <w:t>access control</w:t>
+      </w:r>
+      <w:r>
+        <w:t xml:space="preserve"> using authorization checks in API endpoints, server-side components, and middleware</w:t>
+      </w:r>
+      <w:r>
+        <w:t xml:space="preserve"> </w:t>
+      </w:r>
+      <w:r>
+        <w:t>/</w:t>
+      </w:r>
+      <w:r>
+        <w:t xml:space="preserve"> </w:t>
+      </w:r>
+      <w:r>
+        <w:t>interceptor logic.</w:t>
+      </w:r>
+    </w:p>
+    <w:p>
+      <w:pPr>
+        <w:pStyle w:val="ac"/>
+        <w:numPr>
+          <w:ilvl w:val="0"/>
+          <w:numId w:val="4"/>
+        </w:numPr>
+      </w:pPr>
+      <w:r>
         <w:t xml:space="preserve">Implement </w:t>
       </w:r>
       <w:r>
@@ -1365,7 +1704,7 @@
       <w:pPr>
         <w:pStyle w:val="ac"/>
         <w:numPr>
-          <w:ilvl w:val="0"/>
+          <w:ilvl w:val="1"/>
           <w:numId w:val="6"/>
         </w:numPr>
       </w:pPr>
@@ -1382,22 +1721,34 @@
         <w:t xml:space="preserve"> users, </w:t>
       </w:r>
       <w:r>
-        <w:t>profiles</w:t>
-      </w:r>
-      <w:r>
-        <w:t xml:space="preserve">, </w:t>
-      </w:r>
-      <w:r>
         <w:t xml:space="preserve">articles, </w:t>
       </w:r>
       <w:r>
         <w:t>photos</w:t>
       </w:r>
       <w:r>
+        <w:t>, comments</w:t>
+      </w:r>
+      <w:r>
         <w:t>.</w:t>
       </w:r>
-      <w:r>
-        <w:t xml:space="preserve"> Example (social network): users, posts, photos, comments.</w:t>
+    </w:p>
+    <w:p>
+      <w:pPr>
+        <w:pStyle w:val="ac"/>
+        <w:numPr>
+          <w:ilvl w:val="1"/>
+          <w:numId w:val="6"/>
+        </w:numPr>
+      </w:pPr>
+      <w:r>
+        <w:t>Example (social network): users, posts, comments</w:t>
+      </w:r>
+      <w:r>
+        <w:t>, messages</w:t>
+      </w:r>
+      <w:r>
+        <w:t>.</w:t>
       </w:r>
     </w:p>
     <w:p>
@@ -1437,21 +1788,56 @@
         </w:numPr>
       </w:pPr>
       <w:r>
-        <w:t xml:space="preserve">When changing the DB schema, always use </w:t>
-      </w:r>
-      <w:r>
-        <w:rPr>
-          <w:b/>
-          <w:bCs/>
-        </w:rPr>
-        <w:t>Drizzle</w:t>
-      </w:r>
-      <w:r>
-        <w:rPr>
-          <w:b/>
-          <w:bCs/>
-        </w:rPr>
-        <w:t xml:space="preserve"> migrations</w:t>
+        <w:t xml:space="preserve">Always use </w:t>
+      </w:r>
+      <w:r>
+        <w:rPr>
+          <w:b/>
+          <w:bCs/>
+        </w:rPr>
+        <w:t>Drizzle migrations</w:t>
+      </w:r>
+      <w:r>
+        <w:t xml:space="preserve"> to make changes in the </w:t>
+      </w:r>
+      <w:r>
+        <w:rPr>
+          <w:b/>
+          <w:bCs/>
+        </w:rPr>
+        <w:t>DB schema</w:t>
+      </w:r>
+      <w:r>
+        <w:t>.</w:t>
+      </w:r>
+    </w:p>
+    <w:p>
+      <w:pPr>
+        <w:pStyle w:val="ac"/>
+        <w:numPr>
+          <w:ilvl w:val="1"/>
+          <w:numId w:val="6"/>
+        </w:numPr>
+      </w:pPr>
+      <w:r>
+        <w:t xml:space="preserve">Your </w:t>
+      </w:r>
+      <w:r>
+        <w:rPr>
+          <w:b/>
+          <w:bCs/>
+        </w:rPr>
+        <w:t>DB migration SQL scripts</w:t>
+      </w:r>
+      <w:r>
+        <w:t xml:space="preserve"> should be committed in the </w:t>
+      </w:r>
+      <w:r>
+        <w:rPr>
+          <w:b/>
+          <w:bCs/>
+        </w:rPr>
+        <w:t>GitHub repo</w:t>
       </w:r>
       <w:r>
         <w:t>.</w:t>
@@ -1466,27 +1852,187 @@
         </w:numPr>
       </w:pPr>
       <w:r>
-        <w:t xml:space="preserve">Your </w:t>
-      </w:r>
-      <w:r>
-        <w:rPr>
-          <w:b/>
-          <w:bCs/>
-        </w:rPr>
-        <w:t>DB migration SQL scripts</w:t>
-      </w:r>
-      <w:r>
-        <w:t xml:space="preserve"> should be committed in the </w:t>
-      </w:r>
-      <w:r>
-        <w:rPr>
-          <w:b/>
-          <w:bCs/>
-        </w:rPr>
-        <w:t>GitHub repo</w:t>
-      </w:r>
-      <w:r>
-        <w:t>.</w:t>
+        <w:t xml:space="preserve">Create a database </w:t>
+      </w:r>
+      <w:r>
+        <w:rPr>
+          <w:b/>
+          <w:bCs/>
+        </w:rPr>
+        <w:t>seed script</w:t>
+      </w:r>
+      <w:r>
+        <w:t xml:space="preserve"> to initially insert sample data in DB.</w:t>
+      </w:r>
+    </w:p>
+    <w:p>
+      <w:pPr>
+        <w:pStyle w:val="ac"/>
+        <w:numPr>
+          <w:ilvl w:val="0"/>
+          <w:numId w:val="6"/>
+        </w:numPr>
+      </w:pPr>
+      <w:r>
+        <w:t xml:space="preserve">Implement your database access logic with </w:t>
+      </w:r>
+      <w:r>
+        <w:rPr>
+          <w:b/>
+          <w:bCs/>
+        </w:rPr>
+        <w:t>Drizzle API</w:t>
+      </w:r>
+      <w:r>
+        <w:t>. Ensure you work efficiently with the DB.</w:t>
+      </w:r>
+    </w:p>
+    <w:p>
+      <w:pPr>
+        <w:pStyle w:val="3"/>
+      </w:pPr>
+      <w:r>
+        <w:t>Scalability</w:t>
+      </w:r>
+    </w:p>
+    <w:p>
+      <w:pPr>
+        <w:pStyle w:val="ac"/>
+        <w:numPr>
+          <w:ilvl w:val="0"/>
+          <w:numId w:val="14"/>
+        </w:numPr>
+      </w:pPr>
+      <w:r>
+        <w:t xml:space="preserve">Design the app to </w:t>
+      </w:r>
+      <w:r>
+        <w:rPr>
+          <w:b/>
+          <w:bCs/>
+        </w:rPr>
+        <w:t>scale efficiently</w:t>
+      </w:r>
+      <w:r>
+        <w:t xml:space="preserve"> and maintain </w:t>
+      </w:r>
+      <w:r>
+        <w:rPr>
+          <w:b/>
+          <w:bCs/>
+        </w:rPr>
+        <w:t>performance</w:t>
+      </w:r>
+      <w:r>
+        <w:t xml:space="preserve"> when handling thousands of </w:t>
+      </w:r>
+      <w:r>
+        <w:t>DB</w:t>
+      </w:r>
+      <w:r>
+        <w:t xml:space="preserve"> entities.</w:t>
+      </w:r>
+    </w:p>
+    <w:p>
+      <w:pPr>
+        <w:pStyle w:val="ac"/>
+        <w:numPr>
+          <w:ilvl w:val="0"/>
+          <w:numId w:val="14"/>
+        </w:numPr>
+      </w:pPr>
+      <w:r>
+        <w:t xml:space="preserve">Implement </w:t>
+      </w:r>
+      <w:r>
+        <w:rPr>
+          <w:b/>
+          <w:bCs/>
+        </w:rPr>
+        <w:t>server-side d</w:t>
+      </w:r>
+      <w:r>
+        <w:rPr>
+          <w:b/>
+          <w:bCs/>
+        </w:rPr>
+        <w:t>ata paging</w:t>
+      </w:r>
+      <w:r>
+        <w:t xml:space="preserve"> for data retrieval and display to prevent performance degradation or UI</w:t>
+      </w:r>
+      <w:r>
+        <w:t xml:space="preserve"> </w:t>
+      </w:r>
+      <w:r>
+        <w:t>or</w:t>
+      </w:r>
+      <w:r>
+        <w:t xml:space="preserve"> </w:t>
+      </w:r>
+      <w:r>
+        <w:t>server unresponsiveness when working with large datasets.</w:t>
+      </w:r>
+    </w:p>
+    <w:p>
+      <w:pPr>
+        <w:pStyle w:val="ac"/>
+        <w:numPr>
+          <w:ilvl w:val="0"/>
+          <w:numId w:val="14"/>
+        </w:numPr>
+      </w:pPr>
+      <w:r>
+        <w:t xml:space="preserve">Populate the primary </w:t>
+      </w:r>
+      <w:r>
+        <w:t xml:space="preserve">DB </w:t>
+      </w:r>
+      <w:r>
+        <w:t xml:space="preserve">tables with </w:t>
+      </w:r>
+      <w:r>
+        <w:rPr>
+          <w:b/>
+          <w:bCs/>
+        </w:rPr>
+        <w:t xml:space="preserve">at least </w:t>
+      </w:r>
+      <w:r>
+        <w:rPr>
+          <w:b/>
+          <w:bCs/>
+        </w:rPr>
+        <w:t>10</w:t>
+      </w:r>
+      <w:r>
+        <w:rPr>
+          <w:b/>
+          <w:bCs/>
+        </w:rPr>
+        <w:t>,000 records</w:t>
+      </w:r>
+      <w:r>
+        <w:t xml:space="preserve"> to validate performance under realistic load conditions.</w:t>
+      </w:r>
+      <w:r>
+        <w:rPr>
+          <w:lang w:val="bg-BG"/>
+        </w:rPr>
+        <w:t xml:space="preserve"> </w:t>
+      </w:r>
+      <w:r>
+        <w:t xml:space="preserve">Create </w:t>
+      </w:r>
+      <w:r>
+        <w:rPr>
+          <w:b/>
+          <w:bCs/>
+        </w:rPr>
+        <w:t>DB indexes</w:t>
+      </w:r>
+      <w:r>
+        <w:t xml:space="preserve"> if necessary to speed-up slow DB operations.</w:t>
       </w:r>
     </w:p>
     <w:p>
@@ -1506,48 +2052,58 @@
         </w:numPr>
       </w:pPr>
       <w:r>
-        <w:t xml:space="preserve">Implementing </w:t>
-      </w:r>
-      <w:r>
-        <w:rPr>
-          <w:b/>
-          <w:bCs/>
-        </w:rPr>
-        <w:t>file upload</w:t>
-      </w:r>
-      <w:r>
-        <w:rPr>
-          <w:b/>
-          <w:bCs/>
-        </w:rPr>
-        <w:t>s</w:t>
-      </w:r>
-      <w:r>
-        <w:rPr>
-          <w:b/>
-          <w:bCs/>
-        </w:rPr>
+        <w:t>S</w:t>
+      </w:r>
+      <w:r>
+        <w:t>tore</w:t>
+      </w:r>
+      <w:r>
+        <w:t xml:space="preserve"> app</w:t>
+      </w:r>
+      <w:r>
         <w:t xml:space="preserve"> </w:t>
       </w:r>
       <w:r>
-        <w:t>and</w:t>
-      </w:r>
-      <w:r>
-        <w:rPr>
-          <w:b/>
-          <w:bCs/>
-        </w:rPr>
-        <w:t xml:space="preserve"> download</w:t>
-      </w:r>
-      <w:r>
-        <w:rPr>
-          <w:b/>
-          <w:bCs/>
-        </w:rPr>
-        <w:t>s</w:t>
-      </w:r>
-      <w:r>
-        <w:t xml:space="preserve"> is non mandatory requirement.</w:t>
+        <w:rPr>
+          <w:b/>
+          <w:bCs/>
+        </w:rPr>
+        <w:t xml:space="preserve">user </w:t>
+      </w:r>
+      <w:r>
+        <w:rPr>
+          <w:b/>
+          <w:bCs/>
+        </w:rPr>
+        <w:t>files</w:t>
+      </w:r>
+      <w:r>
+        <w:t xml:space="preserve"> (like photos and documents)</w:t>
+      </w:r>
+      <w:r>
+        <w:t xml:space="preserve"> in</w:t>
+      </w:r>
+      <w:r>
+        <w:t xml:space="preserve"> an </w:t>
+      </w:r>
+      <w:r>
+        <w:rPr>
+          <w:b/>
+          <w:bCs/>
+        </w:rPr>
+        <w:t>object storage</w:t>
+      </w:r>
+      <w:r>
+        <w:t xml:space="preserve"> system (like </w:t>
+      </w:r>
+      <w:r>
+        <w:t>Cloudflare R2</w:t>
+      </w:r>
+      <w:r>
+        <w:t>)</w:t>
+      </w:r>
+      <w:r>
+        <w:t>.</w:t>
       </w:r>
     </w:p>
     <w:p>
@@ -1559,58 +2115,27 @@
         </w:numPr>
       </w:pPr>
       <w:r>
-        <w:t>S</w:t>
-      </w:r>
-      <w:r>
-        <w:t>tore</w:t>
-      </w:r>
-      <w:r>
-        <w:t xml:space="preserve"> app</w:t>
-      </w:r>
-      <w:r>
-        <w:t xml:space="preserve"> </w:t>
-      </w:r>
-      <w:r>
-        <w:rPr>
-          <w:b/>
-          <w:bCs/>
-        </w:rPr>
-        <w:t xml:space="preserve">user </w:t>
-      </w:r>
-      <w:r>
-        <w:rPr>
-          <w:b/>
-          <w:bCs/>
-        </w:rPr>
-        <w:t>files</w:t>
-      </w:r>
-      <w:r>
-        <w:t xml:space="preserve"> (like photos and documents)</w:t>
-      </w:r>
-      <w:r>
-        <w:t xml:space="preserve"> in</w:t>
-      </w:r>
-      <w:r>
-        <w:t xml:space="preserve"> an </w:t>
-      </w:r>
-      <w:r>
-        <w:rPr>
-          <w:b/>
-          <w:bCs/>
-        </w:rPr>
-        <w:t>object storage</w:t>
-      </w:r>
-      <w:r>
-        <w:t xml:space="preserve"> system (like </w:t>
-      </w:r>
-      <w:r>
-        <w:t>Cloudflare R2</w:t>
-      </w:r>
-      <w:r>
-        <w:t>)</w:t>
-      </w:r>
-      <w:r>
-        <w:t>.</w:t>
+        <w:t xml:space="preserve">Implementing </w:t>
+      </w:r>
+      <w:r>
+        <w:rPr>
+          <w:b/>
+          <w:bCs/>
+        </w:rPr>
+        <w:t xml:space="preserve">file uploads </w:t>
+      </w:r>
+      <w:r>
+        <w:t>and</w:t>
+      </w:r>
+      <w:r>
+        <w:rPr>
+          <w:b/>
+          <w:bCs/>
+        </w:rPr>
+        <w:t xml:space="preserve"> downloads</w:t>
+      </w:r>
+      <w:r>
+        <w:t xml:space="preserve"> is a non-mandatory requirement.</w:t>
       </w:r>
     </w:p>
     <w:p>
@@ -1618,6 +2143,7 @@
         <w:pStyle w:val="3"/>
       </w:pPr>
       <w:r>
+        <w:lastRenderedPageBreak/>
         <w:t>Deployment</w:t>
       </w:r>
     </w:p>
@@ -1685,6 +2211,214 @@
         <w:pStyle w:val="3"/>
       </w:pPr>
       <w:r>
+        <w:t>Backup</w:t>
+      </w:r>
+    </w:p>
+    <w:p>
+      <w:pPr>
+        <w:pStyle w:val="ac"/>
+        <w:numPr>
+          <w:ilvl w:val="0"/>
+          <w:numId w:val="10"/>
+        </w:numPr>
+      </w:pPr>
+      <w:r>
+        <w:t>Implement</w:t>
+      </w:r>
+      <w:r>
+        <w:t xml:space="preserve"> automated</w:t>
+      </w:r>
+      <w:r>
+        <w:t xml:space="preserve"> </w:t>
+      </w:r>
+      <w:r>
+        <w:rPr>
+          <w:b/>
+          <w:bCs/>
+        </w:rPr>
+        <w:t>database / file storage</w:t>
+      </w:r>
+      <w:r>
+        <w:t xml:space="preserve"> backup</w:t>
+      </w:r>
+      <w:r>
+        <w:t>s</w:t>
+      </w:r>
+      <w:r>
+        <w:t>:</w:t>
+      </w:r>
+    </w:p>
+    <w:p>
+      <w:pPr>
+        <w:pStyle w:val="ac"/>
+        <w:numPr>
+          <w:ilvl w:val="1"/>
+          <w:numId w:val="10"/>
+        </w:numPr>
+      </w:pPr>
+      <w:r>
+        <w:t xml:space="preserve">Implement the backup script in </w:t>
+      </w:r>
+      <w:r>
+        <w:rPr>
+          <w:b/>
+          <w:bCs/>
+        </w:rPr>
+        <w:t>GitHub Actions</w:t>
+      </w:r>
+      <w:r>
+        <w:t xml:space="preserve"> (provides free, reliable</w:t>
+      </w:r>
+      <w:r>
+        <w:rPr>
+          <w:lang w:val="bg-BG"/>
+        </w:rPr>
+        <w:t xml:space="preserve">, </w:t>
+      </w:r>
+      <w:r>
+        <w:t>short-running VMs).</w:t>
+      </w:r>
+    </w:p>
+    <w:p>
+      <w:pPr>
+        <w:pStyle w:val="ac"/>
+        <w:numPr>
+          <w:ilvl w:val="1"/>
+          <w:numId w:val="10"/>
+        </w:numPr>
+      </w:pPr>
+      <w:r>
+        <w:t xml:space="preserve">Backup the PostgreSQL DB as </w:t>
+      </w:r>
+      <w:r>
+        <w:rPr>
+          <w:b/>
+          <w:bCs/>
+        </w:rPr>
+        <w:t>compressed DB dump</w:t>
+      </w:r>
+      <w:r>
+        <w:t xml:space="preserve"> and the</w:t>
+      </w:r>
+      <w:r>
+        <w:rPr>
+          <w:lang w:val="bg-BG"/>
+        </w:rPr>
+        <w:t xml:space="preserve"> </w:t>
+      </w:r>
+      <w:r>
+        <w:t xml:space="preserve">storage buckets as </w:t>
+      </w:r>
+      <w:r>
+        <w:rPr>
+          <w:b/>
+          <w:bCs/>
+        </w:rPr>
+        <w:t>zip</w:t>
+      </w:r>
+      <w:r>
+        <w:t xml:space="preserve"> archive.</w:t>
+      </w:r>
+    </w:p>
+    <w:p>
+      <w:pPr>
+        <w:pStyle w:val="ac"/>
+        <w:numPr>
+          <w:ilvl w:val="1"/>
+          <w:numId w:val="10"/>
+        </w:numPr>
+      </w:pPr>
+      <w:r>
+        <w:t xml:space="preserve">Keep backup archives in a </w:t>
+      </w:r>
+      <w:r>
+        <w:rPr>
+          <w:b/>
+          <w:bCs/>
+        </w:rPr>
+        <w:t>private object storage</w:t>
+      </w:r>
+      <w:r>
+        <w:t xml:space="preserve"> bucket (e.g. in Cloudflare R2).</w:t>
+      </w:r>
+    </w:p>
+    <w:p>
+      <w:pPr>
+        <w:pStyle w:val="ac"/>
+        <w:numPr>
+          <w:ilvl w:val="1"/>
+          <w:numId w:val="10"/>
+        </w:numPr>
+      </w:pPr>
+      <w:r>
+        <w:t xml:space="preserve">Implement a backup </w:t>
+      </w:r>
+      <w:r>
+        <w:rPr>
+          <w:b/>
+          <w:bCs/>
+        </w:rPr>
+        <w:t>retention policy</w:t>
+      </w:r>
+      <w:r>
+        <w:t xml:space="preserve">: </w:t>
+      </w:r>
+      <w:r>
+        <w:t>7 daily, 5 weekly, 12 monthly</w:t>
+      </w:r>
+      <w:r>
+        <w:t xml:space="preserve"> backups.</w:t>
+      </w:r>
+    </w:p>
+    <w:p>
+      <w:pPr>
+        <w:pStyle w:val="ac"/>
+        <w:numPr>
+          <w:ilvl w:val="1"/>
+          <w:numId w:val="10"/>
+        </w:numPr>
+      </w:pPr>
+      <w:r>
+        <w:t xml:space="preserve">Run the backup script </w:t>
+      </w:r>
+      <w:r>
+        <w:rPr>
+          <w:b/>
+          <w:bCs/>
+        </w:rPr>
+        <w:t>once daily</w:t>
+      </w:r>
+      <w:r>
+        <w:t>, e.g. at 3:00 AM.</w:t>
+      </w:r>
+    </w:p>
+    <w:p>
+      <w:pPr>
+        <w:pStyle w:val="ac"/>
+        <w:numPr>
+          <w:ilvl w:val="0"/>
+          <w:numId w:val="10"/>
+        </w:numPr>
+      </w:pPr>
+      <w:r>
+        <w:t xml:space="preserve">Implementing </w:t>
+      </w:r>
+      <w:r>
+        <w:rPr>
+          <w:b/>
+          <w:bCs/>
+        </w:rPr>
+        <w:t xml:space="preserve">DB / file backups </w:t>
+      </w:r>
+      <w:r>
+        <w:t>is a non-mandatory requirement.</w:t>
+      </w:r>
+    </w:p>
+    <w:p>
+      <w:pPr>
+        <w:pStyle w:val="3"/>
+      </w:pPr>
+      <w:r>
         <w:t>GitHub Repo</w:t>
       </w:r>
     </w:p>
@@ -1868,7 +2602,16 @@
         </w:numPr>
       </w:pPr>
       <w:r>
-        <w:t>Optionally, you can create branches and merge them with pull requests.</w:t>
+        <w:t>You can commit directly or y</w:t>
+      </w:r>
+      <w:r>
+        <w:t xml:space="preserve">ou can </w:t>
+      </w:r>
+      <w:r>
+        <w:t>work in</w:t>
+      </w:r>
+      <w:r>
+        <w:t xml:space="preserve"> branches and merge them with pull requests.</w:t>
       </w:r>
     </w:p>
     <w:p>
@@ -1938,6 +2681,9 @@
         <w:t>, technologies</w:t>
       </w:r>
       <w:r>
+        <w:t xml:space="preserve"> and patterns</w:t>
+      </w:r>
+      <w:r>
         <w:t xml:space="preserve"> </w:t>
       </w:r>
       <w:r>
@@ -1993,7 +2739,6 @@
           <w:b/>
           <w:bCs/>
         </w:rPr>
-        <w:lastRenderedPageBreak/>
         <w:t>Project description</w:t>
       </w:r>
       <w:r>
@@ -2080,17 +2825,40 @@
         </w:numPr>
       </w:pPr>
       <w:r>
-        <w:t xml:space="preserve">Local </w:t>
-      </w:r>
-      <w:r>
-        <w:rPr>
-          <w:b/>
-          <w:bCs/>
-        </w:rPr>
-        <w:t>development setup</w:t>
-      </w:r>
-      <w:r>
-        <w:t xml:space="preserve"> guide.</w:t>
+        <w:rPr>
+          <w:b/>
+          <w:bCs/>
+        </w:rPr>
+        <w:t>Repo structure</w:t>
+      </w:r>
+      <w:r>
+        <w:t>: k</w:t>
+      </w:r>
+      <w:r>
+        <w:t xml:space="preserve">ey </w:t>
+      </w:r>
+      <w:r>
+        <w:rPr>
+          <w:b/>
+          <w:bCs/>
+        </w:rPr>
+        <w:t>folders</w:t>
+      </w:r>
+      <w:r>
+        <w:t>,</w:t>
+      </w:r>
+      <w:r>
+        <w:t xml:space="preserve"> </w:t>
+      </w:r>
+      <w:r>
+        <w:rPr>
+          <w:b/>
+          <w:bCs/>
+        </w:rPr>
+        <w:t>files</w:t>
+      </w:r>
+      <w:r>
+        <w:t xml:space="preserve"> and their purpose.</w:t>
       </w:r>
     </w:p>
     <w:p>
@@ -2102,27 +2870,17 @@
         </w:numPr>
       </w:pPr>
       <w:r>
-        <w:t xml:space="preserve">Key </w:t>
-      </w:r>
-      <w:r>
-        <w:rPr>
-          <w:b/>
-          <w:bCs/>
-        </w:rPr>
-        <w:t>folders</w:t>
-      </w:r>
-      <w:r>
-        <w:t xml:space="preserve"> and </w:t>
-      </w:r>
-      <w:r>
-        <w:rPr>
-          <w:b/>
-          <w:bCs/>
-        </w:rPr>
-        <w:t>files</w:t>
-      </w:r>
-      <w:r>
-        <w:t xml:space="preserve"> and their purpose.</w:t>
+        <w:t xml:space="preserve">Local </w:t>
+      </w:r>
+      <w:r>
+        <w:rPr>
+          <w:b/>
+          <w:bCs/>
+        </w:rPr>
+        <w:t>development setup</w:t>
+      </w:r>
+      <w:r>
+        <w:t xml:space="preserve"> guide: how to clone and run your app.</w:t>
       </w:r>
     </w:p>
     <w:p>
@@ -2162,7 +2920,10 @@
         <w:t>GitHub Copilot</w:t>
       </w:r>
       <w:r>
-        <w:t xml:space="preserve"> / </w:t>
+        <w:t>,</w:t>
+      </w:r>
+      <w:r>
+        <w:t xml:space="preserve"> </w:t>
       </w:r>
       <w:r>
         <w:rPr>
@@ -2170,6 +2931,36 @@
           <w:bCs/>
         </w:rPr>
         <w:t>Claude Code</w:t>
+      </w:r>
+      <w:r>
+        <w:t xml:space="preserve">, </w:t>
+      </w:r>
+      <w:r>
+        <w:rPr>
+          <w:b/>
+          <w:bCs/>
+        </w:rPr>
+        <w:t>Codex</w:t>
+      </w:r>
+      <w:r>
+        <w:t xml:space="preserve">, </w:t>
+      </w:r>
+      <w:r>
+        <w:rPr>
+          <w:b/>
+          <w:bCs/>
+        </w:rPr>
+        <w:t>Roo Code</w:t>
+      </w:r>
+      <w:r>
+        <w:t xml:space="preserve">, </w:t>
+      </w:r>
+      <w:r>
+        <w:rPr>
+          <w:b/>
+          <w:bCs/>
+        </w:rPr>
+        <w:t>Cursor</w:t>
       </w:r>
       <w:r>
         <w:t>.</w:t>
@@ -2263,6 +3054,7 @@
         <w:pStyle w:val="2"/>
       </w:pPr>
       <w:r>
+        <w:lastRenderedPageBreak/>
         <w:t xml:space="preserve">Project </w:t>
       </w:r>
       <w:r>
@@ -2443,6 +3235,8 @@
             </w:r>
             <w:r>
               <w:rPr>
+                <w:b/>
+                <w:bCs/>
                 <w:sz w:val="24"/>
                 <w:szCs w:val="24"/>
               </w:rPr>
@@ -2542,7 +3336,16 @@
                 <w:sz w:val="24"/>
                 <w:szCs w:val="24"/>
               </w:rPr>
-              <w:t xml:space="preserve"> 3 different days</w:t>
+              <w:t xml:space="preserve"> </w:t>
+            </w:r>
+            <w:r>
+              <w:rPr>
+                <w:b/>
+                <w:bCs/>
+                <w:sz w:val="24"/>
+                <w:szCs w:val="24"/>
+              </w:rPr>
+              <w:t>3 different days</w:t>
             </w:r>
             <w:r>
               <w:rPr>
@@ -2624,73 +3427,100 @@
             </w:pPr>
             <w:r>
               <w:rPr>
+                <w:b/>
+                <w:bCs/>
                 <w:sz w:val="24"/>
                 <w:szCs w:val="24"/>
               </w:rPr>
-              <w:t>Project structure (</w:t>
+              <w:t>Project structure</w:t>
             </w:r>
             <w:r>
               <w:rPr>
                 <w:sz w:val="24"/>
                 <w:szCs w:val="24"/>
               </w:rPr>
-              <w:t>monorepo</w:t>
+              <w:t xml:space="preserve"> (</w:t>
             </w:r>
             <w:r>
               <w:rPr>
                 <w:sz w:val="24"/>
                 <w:szCs w:val="24"/>
               </w:rPr>
-              <w:t xml:space="preserve">, </w:t>
+              <w:t>monorepo</w:t>
             </w:r>
             <w:r>
               <w:rPr>
                 <w:sz w:val="24"/>
                 <w:szCs w:val="24"/>
               </w:rPr>
-              <w:t>Next.js app, Expo app</w:t>
+              <w:t xml:space="preserve">, </w:t>
             </w:r>
             <w:r>
               <w:rPr>
                 <w:sz w:val="24"/>
                 <w:szCs w:val="24"/>
               </w:rPr>
-              <w:t>)</w:t>
+              <w:t>Next.js app, Expo app</w:t>
             </w:r>
             <w:r>
               <w:rPr>
                 <w:sz w:val="24"/>
                 <w:szCs w:val="24"/>
               </w:rPr>
-              <w:t>,</w:t>
+              <w:t>)</w:t>
             </w:r>
             <w:r>
               <w:rPr>
                 <w:sz w:val="24"/>
                 <w:szCs w:val="24"/>
               </w:rPr>
-              <w:t xml:space="preserve"> </w:t>
+              <w:t>,</w:t>
             </w:r>
             <w:r>
               <w:rPr>
                 <w:sz w:val="24"/>
                 <w:szCs w:val="24"/>
               </w:rPr>
-              <w:t xml:space="preserve">client-server architecture, </w:t>
-            </w:r>
-            <w:r>
-              <w:rPr>
+              <w:t xml:space="preserve"> </w:t>
+            </w:r>
+            <w:r>
+              <w:rPr>
+                <w:b/>
+                <w:bCs/>
                 <w:sz w:val="24"/>
                 <w:szCs w:val="24"/>
               </w:rPr>
-              <w:t>app components</w:t>
+              <w:t>client-server</w:t>
             </w:r>
             <w:r>
               <w:rPr>
                 <w:sz w:val="24"/>
                 <w:szCs w:val="24"/>
               </w:rPr>
-              <w:t xml:space="preserve"> communicate over HTTP</w:t>
+              <w:t xml:space="preserve"> architecture</w:t>
+            </w:r>
+            <w:r>
+              <w:rPr>
+                <w:sz w:val="24"/>
+                <w:szCs w:val="24"/>
+              </w:rPr>
+              <w:t xml:space="preserve"> with </w:t>
+            </w:r>
+            <w:r>
+              <w:rPr>
+                <w:b/>
+                <w:bCs/>
+                <w:sz w:val="24"/>
+                <w:szCs w:val="24"/>
+              </w:rPr>
+              <w:t>HTTP</w:t>
+            </w:r>
+            <w:r>
+              <w:rPr>
+                <w:sz w:val="24"/>
+                <w:szCs w:val="24"/>
+              </w:rPr>
+              <w:t xml:space="preserve"> communication</w:t>
             </w:r>
           </w:p>
         </w:tc>
@@ -2730,7 +3560,7 @@
                 <w:b/>
                 <w:bCs/>
               </w:rPr>
-              <w:t>Backend API</w:t>
+              <w:t>Backend</w:t>
             </w:r>
           </w:p>
         </w:tc>
@@ -2747,7 +3577,7 @@
               <w:t>0…</w:t>
             </w:r>
             <w:r>
-              <w:t>7</w:t>
+              <w:t>5</w:t>
             </w:r>
           </w:p>
         </w:tc>
@@ -2765,10 +3595,74 @@
             </w:pPr>
             <w:r>
               <w:rPr>
+                <w:b/>
+                <w:bCs/>
                 <w:sz w:val="24"/>
                 <w:szCs w:val="24"/>
               </w:rPr>
-              <w:t>Implement backend API endpoints (with authentication)</w:t>
+              <w:t>B</w:t>
+            </w:r>
+            <w:r>
+              <w:rPr>
+                <w:b/>
+                <w:bCs/>
+                <w:sz w:val="24"/>
+                <w:szCs w:val="24"/>
+              </w:rPr>
+              <w:t xml:space="preserve">ackend </w:t>
+            </w:r>
+            <w:r>
+              <w:rPr>
+                <w:b/>
+                <w:bCs/>
+                <w:sz w:val="24"/>
+                <w:szCs w:val="24"/>
+              </w:rPr>
+              <w:t>services</w:t>
+            </w:r>
+            <w:r>
+              <w:rPr>
+                <w:sz w:val="24"/>
+                <w:szCs w:val="24"/>
+              </w:rPr>
+              <w:t xml:space="preserve"> and </w:t>
+            </w:r>
+            <w:r>
+              <w:rPr>
+                <w:b/>
+                <w:bCs/>
+                <w:sz w:val="24"/>
+                <w:szCs w:val="24"/>
+              </w:rPr>
+              <w:t>API endpoints</w:t>
+            </w:r>
+            <w:r>
+              <w:rPr>
+                <w:sz w:val="24"/>
+                <w:szCs w:val="24"/>
+              </w:rPr>
+              <w:t xml:space="preserve">, with </w:t>
+            </w:r>
+            <w:r>
+              <w:rPr>
+                <w:sz w:val="24"/>
+                <w:szCs w:val="24"/>
+              </w:rPr>
+              <w:t>DB</w:t>
+            </w:r>
+            <w:r>
+              <w:rPr>
+                <w:sz w:val="24"/>
+                <w:szCs w:val="24"/>
+              </w:rPr>
+              <w:t xml:space="preserve"> persistence</w:t>
+            </w:r>
+            <w:r>
+              <w:rPr>
+                <w:sz w:val="24"/>
+                <w:szCs w:val="24"/>
+              </w:rPr>
+              <w:t xml:space="preserve"> and auth system</w:t>
             </w:r>
           </w:p>
         </w:tc>
@@ -2822,7 +3716,10 @@
               <w:jc w:val="center"/>
             </w:pPr>
             <w:r>
-              <w:t>0…8</w:t>
+              <w:t>0…</w:t>
+            </w:r>
+            <w:r>
+              <w:t>5</w:t>
             </w:r>
           </w:p>
         </w:tc>
@@ -2843,7 +3740,55 @@
                 <w:sz w:val="24"/>
                 <w:szCs w:val="24"/>
               </w:rPr>
-              <w:t>App uses at least 4 DB tables (2 score per table, max 8), with ORM and migrations</w:t>
+              <w:t>A</w:t>
+            </w:r>
+            <w:r>
+              <w:rPr>
+                <w:sz w:val="24"/>
+                <w:szCs w:val="24"/>
+              </w:rPr>
+              <w:t xml:space="preserve">t least </w:t>
+            </w:r>
+            <w:r>
+              <w:rPr>
+                <w:b/>
+                <w:bCs/>
+                <w:sz w:val="24"/>
+                <w:szCs w:val="24"/>
+              </w:rPr>
+              <w:t>4 DB tables</w:t>
+            </w:r>
+            <w:r>
+              <w:rPr>
+                <w:sz w:val="24"/>
+                <w:szCs w:val="24"/>
+              </w:rPr>
+              <w:t xml:space="preserve"> (2 score per table, max 8), with </w:t>
+            </w:r>
+            <w:r>
+              <w:rPr>
+                <w:b/>
+                <w:bCs/>
+                <w:sz w:val="24"/>
+                <w:szCs w:val="24"/>
+              </w:rPr>
+              <w:t xml:space="preserve">Drizzle </w:t>
+            </w:r>
+            <w:r>
+              <w:rPr>
+                <w:b/>
+                <w:bCs/>
+                <w:sz w:val="24"/>
+                <w:szCs w:val="24"/>
+              </w:rPr>
+              <w:t>ORM</w:t>
+            </w:r>
+            <w:r>
+              <w:rPr>
+                <w:sz w:val="24"/>
+                <w:szCs w:val="24"/>
+              </w:rPr>
+              <w:t xml:space="preserve"> and migrations</w:t>
             </w:r>
           </w:p>
         </w:tc>
@@ -2883,7 +3828,7 @@
                 <w:b/>
                 <w:bCs/>
               </w:rPr>
-              <w:t>Auth and Security</w:t>
+              <w:t>Users and Roles</w:t>
             </w:r>
           </w:p>
         </w:tc>
@@ -2918,7 +3863,64 @@
                 <w:sz w:val="24"/>
                 <w:szCs w:val="24"/>
               </w:rPr>
-              <w:t>Correct handling of user permissions at the server-side</w:t>
+              <w:t xml:space="preserve">Implemented correctly </w:t>
+            </w:r>
+            <w:r>
+              <w:rPr>
+                <w:b/>
+                <w:bCs/>
+                <w:sz w:val="24"/>
+                <w:szCs w:val="24"/>
+              </w:rPr>
+              <w:t>users</w:t>
+            </w:r>
+            <w:r>
+              <w:rPr>
+                <w:sz w:val="24"/>
+                <w:szCs w:val="24"/>
+              </w:rPr>
+              <w:t xml:space="preserve">, </w:t>
+            </w:r>
+            <w:r>
+              <w:rPr>
+                <w:b/>
+                <w:bCs/>
+                <w:sz w:val="24"/>
+                <w:szCs w:val="24"/>
+              </w:rPr>
+              <w:t>roles</w:t>
+            </w:r>
+            <w:r>
+              <w:rPr>
+                <w:sz w:val="24"/>
+                <w:szCs w:val="24"/>
+              </w:rPr>
+              <w:t xml:space="preserve">, login, register, logout, </w:t>
+            </w:r>
+            <w:r>
+              <w:rPr>
+                <w:b/>
+                <w:bCs/>
+                <w:sz w:val="24"/>
+                <w:szCs w:val="24"/>
+              </w:rPr>
+              <w:t>authentication</w:t>
+            </w:r>
+            <w:r>
+              <w:rPr>
+                <w:sz w:val="24"/>
+                <w:szCs w:val="24"/>
+              </w:rPr>
+              <w:t xml:space="preserve"> and </w:t>
+            </w:r>
+            <w:r>
+              <w:rPr>
+                <w:b/>
+                <w:bCs/>
+                <w:sz w:val="24"/>
+                <w:szCs w:val="24"/>
+              </w:rPr>
+              <w:t>authorization</w:t>
             </w:r>
           </w:p>
         </w:tc>
@@ -2931,9 +3933,6 @@
             <w:pPr>
               <w:jc w:val="center"/>
             </w:pPr>
-            <w:r>
-              <w:t>…</w:t>
-            </w:r>
           </w:p>
         </w:tc>
       </w:tr>
@@ -2958,14 +3957,7 @@
                 <w:b/>
                 <w:bCs/>
               </w:rPr>
-              <w:t xml:space="preserve">Web </w:t>
-            </w:r>
-            <w:r>
-              <w:rPr>
-                <w:b/>
-                <w:bCs/>
-              </w:rPr>
-              <w:t>App Screens</w:t>
+              <w:t>Scalability</w:t>
             </w:r>
           </w:p>
         </w:tc>
@@ -2979,7 +3971,7 @@
               <w:jc w:val="center"/>
             </w:pPr>
             <w:r>
-              <w:t>0…10</w:t>
+              <w:t>0…5</w:t>
             </w:r>
           </w:p>
         </w:tc>
@@ -2997,10 +3989,35 @@
             </w:pPr>
             <w:r>
               <w:rPr>
+                <w:b/>
+                <w:bCs/>
                 <w:sz w:val="24"/>
                 <w:szCs w:val="24"/>
               </w:rPr>
-              <w:t>Implement at least 5 app screens, with responsive design (2 score per screen, max 10)</w:t>
+              <w:t>P</w:t>
+            </w:r>
+            <w:r>
+              <w:rPr>
+                <w:b/>
+                <w:bCs/>
+                <w:sz w:val="24"/>
+                <w:szCs w:val="24"/>
+              </w:rPr>
+              <w:t>aging</w:t>
+            </w:r>
+            <w:r>
+              <w:rPr>
+                <w:sz w:val="24"/>
+                <w:szCs w:val="24"/>
+              </w:rPr>
+              <w:t xml:space="preserve"> in the APIs and UI</w:t>
+            </w:r>
+            <w:r>
+              <w:rPr>
+                <w:sz w:val="24"/>
+                <w:szCs w:val="24"/>
+              </w:rPr>
+              <w:t xml:space="preserve"> for large tables, tested with large datasets</w:t>
             </w:r>
           </w:p>
         </w:tc>
@@ -3013,9 +4030,6 @@
             <w:pPr>
               <w:jc w:val="center"/>
             </w:pPr>
-            <w:r>
-              <w:t>…</w:t>
-            </w:r>
           </w:p>
         </w:tc>
       </w:tr>
@@ -3040,7 +4054,14 @@
                 <w:b/>
                 <w:bCs/>
               </w:rPr>
-              <w:t>Admin Panel</w:t>
+              <w:t xml:space="preserve">Web </w:t>
+            </w:r>
+            <w:r>
+              <w:rPr>
+                <w:b/>
+                <w:bCs/>
+              </w:rPr>
+              <w:t>App</w:t>
             </w:r>
           </w:p>
         </w:tc>
@@ -3054,7 +4075,10 @@
               <w:jc w:val="center"/>
             </w:pPr>
             <w:r>
-              <w:t>0..10</w:t>
+              <w:t>0…1</w:t>
+            </w:r>
+            <w:r>
+              <w:t>5</w:t>
             </w:r>
           </w:p>
         </w:tc>
@@ -3075,7 +4099,46 @@
                 <w:sz w:val="24"/>
                 <w:szCs w:val="24"/>
               </w:rPr>
-              <w:t>Implement users, roles and admin panel (or special users)</w:t>
+              <w:t>Implement</w:t>
+            </w:r>
+            <w:r>
+              <w:rPr>
+                <w:sz w:val="24"/>
+                <w:szCs w:val="24"/>
+              </w:rPr>
+              <w:t>ed</w:t>
+            </w:r>
+            <w:r>
+              <w:rPr>
+                <w:sz w:val="24"/>
+                <w:szCs w:val="24"/>
+              </w:rPr>
+              <w:t xml:space="preserve"> at least </w:t>
+            </w:r>
+            <w:r>
+              <w:rPr>
+                <w:b/>
+                <w:bCs/>
+                <w:sz w:val="24"/>
+                <w:szCs w:val="24"/>
+              </w:rPr>
+              <w:t>10</w:t>
+            </w:r>
+            <w:r>
+              <w:rPr>
+                <w:b/>
+                <w:bCs/>
+                <w:sz w:val="24"/>
+                <w:szCs w:val="24"/>
+              </w:rPr>
+              <w:t xml:space="preserve"> app screens</w:t>
+            </w:r>
+            <w:r>
+              <w:rPr>
+                <w:sz w:val="24"/>
+                <w:szCs w:val="24"/>
+              </w:rPr>
+              <w:t>, with responsive design</w:t>
             </w:r>
           </w:p>
         </w:tc>
@@ -3115,14 +4178,7 @@
                 <w:b/>
                 <w:bCs/>
               </w:rPr>
-              <w:t xml:space="preserve">Mobile </w:t>
-            </w:r>
-            <w:r>
-              <w:rPr>
-                <w:b/>
-                <w:bCs/>
-              </w:rPr>
-              <w:t>App</w:t>
+              <w:t>Admin Panel</w:t>
             </w:r>
           </w:p>
         </w:tc>
@@ -3136,10 +4192,10 @@
               <w:jc w:val="center"/>
             </w:pPr>
             <w:r>
-              <w:t>0…</w:t>
-            </w:r>
-            <w:r>
-              <w:t>9</w:t>
+              <w:t>0</w:t>
+            </w:r>
+            <w:r>
+              <w:t>…5</w:t>
             </w:r>
           </w:p>
         </w:tc>
@@ -3160,42 +4216,55 @@
                 <w:sz w:val="24"/>
                 <w:szCs w:val="24"/>
               </w:rPr>
-              <w:t>Implement a client mobile app, connecting to the server API, with</w:t>
-            </w:r>
-            <w:r>
-              <w:rPr>
+              <w:t xml:space="preserve">Implement </w:t>
+            </w:r>
+            <w:r>
+              <w:rPr>
+                <w:b/>
+                <w:bCs/>
                 <w:sz w:val="24"/>
                 <w:szCs w:val="24"/>
               </w:rPr>
-              <w:t xml:space="preserve"> at least 3 mobile app screens (</w:t>
+              <w:t>users</w:t>
             </w:r>
             <w:r>
               <w:rPr>
                 <w:sz w:val="24"/>
                 <w:szCs w:val="24"/>
               </w:rPr>
-              <w:t>3</w:t>
-            </w:r>
-            <w:r>
-              <w:rPr>
+              <w:t xml:space="preserve">, </w:t>
+            </w:r>
+            <w:r>
+              <w:rPr>
+                <w:b/>
+                <w:bCs/>
                 <w:sz w:val="24"/>
                 <w:szCs w:val="24"/>
               </w:rPr>
-              <w:t xml:space="preserve"> score per screen, max </w:t>
+              <w:t>roles</w:t>
             </w:r>
             <w:r>
               <w:rPr>
                 <w:sz w:val="24"/>
                 <w:szCs w:val="24"/>
               </w:rPr>
-              <w:t>9</w:t>
-            </w:r>
-            <w:r>
-              <w:rPr>
+              <w:t xml:space="preserve"> and </w:t>
+            </w:r>
+            <w:r>
+              <w:rPr>
+                <w:b/>
+                <w:bCs/>
                 <w:sz w:val="24"/>
                 <w:szCs w:val="24"/>
               </w:rPr>
-              <w:t>)</w:t>
+              <w:t>admin panel</w:t>
+            </w:r>
+            <w:r>
+              <w:rPr>
+                <w:sz w:val="24"/>
+                <w:szCs w:val="24"/>
+              </w:rPr>
+              <w:t xml:space="preserve"> (or special users)</w:t>
             </w:r>
           </w:p>
         </w:tc>
@@ -3235,7 +4304,14 @@
                 <w:b/>
                 <w:bCs/>
               </w:rPr>
-              <w:t>Deployment</w:t>
+              <w:t xml:space="preserve">Mobile </w:t>
+            </w:r>
+            <w:r>
+              <w:rPr>
+                <w:b/>
+                <w:bCs/>
+              </w:rPr>
+              <w:t>App</w:t>
             </w:r>
           </w:p>
         </w:tc>
@@ -3252,7 +4328,10 @@
               <w:t>0…</w:t>
             </w:r>
             <w:r>
-              <w:t>10</w:t>
+              <w:t>1</w:t>
+            </w:r>
+            <w:r>
+              <w:t>5</w:t>
             </w:r>
           </w:p>
         </w:tc>
@@ -3273,7 +4352,32 @@
                 <w:sz w:val="24"/>
                 <w:szCs w:val="24"/>
               </w:rPr>
-              <w:t>Project is published live on the Internet and works properly</w:t>
+              <w:t>Implement a client mobile app, connecting to the server API, with</w:t>
+            </w:r>
+            <w:r>
+              <w:rPr>
+                <w:sz w:val="24"/>
+                <w:szCs w:val="24"/>
+              </w:rPr>
+              <w:t xml:space="preserve"> at least </w:t>
+            </w:r>
+            <w:r>
+              <w:rPr>
+                <w:b/>
+                <w:bCs/>
+                <w:sz w:val="24"/>
+                <w:szCs w:val="24"/>
+              </w:rPr>
+              <w:t>5</w:t>
+            </w:r>
+            <w:r>
+              <w:rPr>
+                <w:b/>
+                <w:bCs/>
+                <w:sz w:val="24"/>
+                <w:szCs w:val="24"/>
+              </w:rPr>
+              <w:t xml:space="preserve"> mobile app screens</w:t>
             </w:r>
           </w:p>
         </w:tc>
@@ -3313,7 +4417,7 @@
                 <w:b/>
                 <w:bCs/>
               </w:rPr>
-              <w:t>Documentation</w:t>
+              <w:t>Deployment</w:t>
             </w:r>
           </w:p>
         </w:tc>
@@ -3330,7 +4434,7 @@
               <w:t>0…</w:t>
             </w:r>
             <w:r>
-              <w:t>6</w:t>
+              <w:t>5</w:t>
             </w:r>
           </w:p>
         </w:tc>
@@ -3351,7 +4455,23 @@
                 <w:sz w:val="24"/>
                 <w:szCs w:val="24"/>
               </w:rPr>
-              <w:t>Project documentation in the GitHub repo</w:t>
+              <w:t xml:space="preserve">Project is </w:t>
+            </w:r>
+            <w:r>
+              <w:rPr>
+                <w:b/>
+                <w:bCs/>
+                <w:sz w:val="24"/>
+                <w:szCs w:val="24"/>
+              </w:rPr>
+              <w:t>published live</w:t>
+            </w:r>
+            <w:r>
+              <w:rPr>
+                <w:sz w:val="24"/>
+                <w:szCs w:val="24"/>
+              </w:rPr>
+              <w:t xml:space="preserve"> on the Internet and works properly</w:t>
             </w:r>
           </w:p>
         </w:tc>
@@ -3370,11 +4490,288 @@
           </w:p>
         </w:tc>
       </w:tr>
+      <w:tr>
+        <w:trPr>
+          <w:trHeight w:val="439"/>
+        </w:trPr>
+        <w:tc>
+          <w:tcPr>
+            <w:tcW w:w="2207" w:type="dxa"/>
+            <w:vAlign w:val="center"/>
+          </w:tcPr>
+          <w:p>
+            <w:pPr>
+              <w:rPr>
+                <w:b/>
+                <w:bCs/>
+              </w:rPr>
+            </w:pPr>
+            <w:r>
+              <w:rPr>
+                <w:b/>
+                <w:bCs/>
+              </w:rPr>
+              <w:t>Documentation</w:t>
+            </w:r>
+          </w:p>
+        </w:tc>
+        <w:tc>
+          <w:tcPr>
+            <w:tcW w:w="744" w:type="dxa"/>
+            <w:vAlign w:val="center"/>
+          </w:tcPr>
+          <w:p>
+            <w:pPr>
+              <w:jc w:val="center"/>
+            </w:pPr>
+            <w:r>
+              <w:t>0…</w:t>
+            </w:r>
+            <w:r>
+              <w:t>5</w:t>
+            </w:r>
+          </w:p>
+        </w:tc>
+        <w:tc>
+          <w:tcPr>
+            <w:tcW w:w="6400" w:type="dxa"/>
+            <w:vAlign w:val="center"/>
+          </w:tcPr>
+          <w:p>
+            <w:pPr>
+              <w:rPr>
+                <w:sz w:val="24"/>
+                <w:szCs w:val="24"/>
+              </w:rPr>
+            </w:pPr>
+            <w:r>
+              <w:rPr>
+                <w:sz w:val="24"/>
+                <w:szCs w:val="24"/>
+              </w:rPr>
+              <w:t xml:space="preserve">Project </w:t>
+            </w:r>
+            <w:r>
+              <w:rPr>
+                <w:b/>
+                <w:bCs/>
+                <w:sz w:val="24"/>
+                <w:szCs w:val="24"/>
+              </w:rPr>
+              <w:t>documentation</w:t>
+            </w:r>
+            <w:r>
+              <w:rPr>
+                <w:sz w:val="24"/>
+                <w:szCs w:val="24"/>
+              </w:rPr>
+              <w:t xml:space="preserve"> in the GitHub repo</w:t>
+            </w:r>
+          </w:p>
+        </w:tc>
+        <w:tc>
+          <w:tcPr>
+            <w:tcW w:w="1134" w:type="dxa"/>
+            <w:vAlign w:val="center"/>
+          </w:tcPr>
+          <w:p>
+            <w:pPr>
+              <w:jc w:val="center"/>
+            </w:pPr>
+            <w:r>
+              <w:t>…</w:t>
+            </w:r>
+          </w:p>
+        </w:tc>
+      </w:tr>
+      <w:tr>
+        <w:trPr>
+          <w:trHeight w:val="439"/>
+        </w:trPr>
+        <w:tc>
+          <w:tcPr>
+            <w:tcW w:w="2207" w:type="dxa"/>
+          </w:tcPr>
+          <w:p>
+            <w:pPr>
+              <w:rPr>
+                <w:b/>
+                <w:bCs/>
+              </w:rPr>
+            </w:pPr>
+            <w:r>
+              <w:rPr>
+                <w:b/>
+                <w:bCs/>
+              </w:rPr>
+              <w:t>File Uploads (Bonus)</w:t>
+            </w:r>
+          </w:p>
+        </w:tc>
+        <w:tc>
+          <w:tcPr>
+            <w:tcW w:w="744" w:type="dxa"/>
+          </w:tcPr>
+          <w:p>
+            <w:pPr>
+              <w:jc w:val="center"/>
+            </w:pPr>
+            <w:r>
+              <w:t>-</w:t>
+            </w:r>
+          </w:p>
+        </w:tc>
+        <w:tc>
+          <w:tcPr>
+            <w:tcW w:w="6400" w:type="dxa"/>
+          </w:tcPr>
+          <w:p>
+            <w:pPr>
+              <w:rPr>
+                <w:sz w:val="24"/>
+                <w:szCs w:val="24"/>
+              </w:rPr>
+            </w:pPr>
+            <w:r>
+              <w:rPr>
+                <w:sz w:val="24"/>
+                <w:szCs w:val="24"/>
+              </w:rPr>
+              <w:t xml:space="preserve">Files / photos </w:t>
+            </w:r>
+            <w:r>
+              <w:rPr>
+                <w:b/>
+                <w:bCs/>
+                <w:sz w:val="24"/>
+                <w:szCs w:val="24"/>
+              </w:rPr>
+              <w:t>uploads</w:t>
+            </w:r>
+            <w:r>
+              <w:rPr>
+                <w:sz w:val="24"/>
+                <w:szCs w:val="24"/>
+              </w:rPr>
+              <w:t xml:space="preserve"> / </w:t>
+            </w:r>
+            <w:r>
+              <w:rPr>
+                <w:b/>
+                <w:bCs/>
+                <w:sz w:val="24"/>
+                <w:szCs w:val="24"/>
+              </w:rPr>
+              <w:t>downloads</w:t>
+            </w:r>
+            <w:r>
+              <w:rPr>
+                <w:sz w:val="24"/>
+                <w:szCs w:val="24"/>
+              </w:rPr>
+              <w:t xml:space="preserve"> from object storage</w:t>
+            </w:r>
+          </w:p>
+        </w:tc>
+        <w:tc>
+          <w:tcPr>
+            <w:tcW w:w="1134" w:type="dxa"/>
+          </w:tcPr>
+          <w:p>
+            <w:pPr>
+              <w:jc w:val="center"/>
+            </w:pPr>
+            <w:r>
+              <w:t>…</w:t>
+            </w:r>
+          </w:p>
+        </w:tc>
+      </w:tr>
+      <w:tr>
+        <w:trPr>
+          <w:trHeight w:val="439"/>
+        </w:trPr>
+        <w:tc>
+          <w:tcPr>
+            <w:tcW w:w="2207" w:type="dxa"/>
+          </w:tcPr>
+          <w:p>
+            <w:pPr>
+              <w:rPr>
+                <w:b/>
+                <w:bCs/>
+              </w:rPr>
+            </w:pPr>
+            <w:r>
+              <w:rPr>
+                <w:b/>
+                <w:bCs/>
+              </w:rPr>
+              <w:t>Backups (Bonus)</w:t>
+            </w:r>
+          </w:p>
+        </w:tc>
+        <w:tc>
+          <w:tcPr>
+            <w:tcW w:w="744" w:type="dxa"/>
+          </w:tcPr>
+          <w:p>
+            <w:pPr>
+              <w:jc w:val="center"/>
+            </w:pPr>
+            <w:r>
+              <w:t>-</w:t>
+            </w:r>
+          </w:p>
+        </w:tc>
+        <w:tc>
+          <w:tcPr>
+            <w:tcW w:w="6400" w:type="dxa"/>
+          </w:tcPr>
+          <w:p>
+            <w:pPr>
+              <w:rPr>
+                <w:sz w:val="24"/>
+                <w:szCs w:val="24"/>
+              </w:rPr>
+            </w:pPr>
+            <w:r>
+              <w:rPr>
+                <w:sz w:val="24"/>
+                <w:szCs w:val="24"/>
+              </w:rPr>
+              <w:t xml:space="preserve">Automated DB / file storage </w:t>
+            </w:r>
+            <w:r>
+              <w:rPr>
+                <w:b/>
+                <w:bCs/>
+                <w:sz w:val="24"/>
+                <w:szCs w:val="24"/>
+              </w:rPr>
+              <w:t>backups</w:t>
+            </w:r>
+          </w:p>
+        </w:tc>
+        <w:tc>
+          <w:tcPr>
+            <w:tcW w:w="1134" w:type="dxa"/>
+          </w:tcPr>
+          <w:p>
+            <w:pPr>
+              <w:jc w:val="center"/>
+            </w:pPr>
+            <w:r>
+              <w:t>…</w:t>
+            </w:r>
+          </w:p>
+        </w:tc>
+      </w:tr>
     </w:tbl>
     <w:p/>
     <w:sectPr>
-      <w:headerReference w:type="default" r:id="rId8"/>
-      <w:footerReference w:type="default" r:id="rId9"/>
+      <w:headerReference w:type="default" r:id="rId12"/>
+      <w:footerReference w:type="default" r:id="rId13"/>
       <w:pgSz w:w="11909" w:h="16834" w:code="9"/>
       <w:pgMar w:top="567" w:right="737" w:bottom="1077" w:left="737" w:header="567" w:footer="794" w:gutter="0"/>
       <w:cols w:space="720"/>
@@ -4298,7 +5695,7 @@
                           <wp:extent cx="229235" cy="172720"/>
                           <wp:effectExtent l="0" t="0" r="0" b="0"/>
                           <wp:docPr id="2132183702" name="Picture 1" descr="A blue and purple logo&#10;&#10;Description automatically generated">
-                            <a:hlinkClick xmlns:a="http://schemas.openxmlformats.org/drawingml/2006/main" r:id="rId1"/>
+                            <a:hlinkClick xmlns:a="http://schemas.openxmlformats.org/drawingml/2006/main" r:id="rId16"/>
                           </wp:docPr>
                           <wp:cNvGraphicFramePr>
                             <a:graphicFrameLocks xmlns:a="http://schemas.openxmlformats.org/drawingml/2006/main" noChangeAspect="1"/>
@@ -4308,14 +5705,14 @@
                               <pic:pic xmlns:pic="http://schemas.openxmlformats.org/drawingml/2006/picture">
                                 <pic:nvPicPr>
                                   <pic:cNvPr id="2132183702" name="Picture 2132183702" descr="A blue and purple logo&#10;&#10;Description automatically generated">
-                                    <a:hlinkClick r:id="rId1"/>
+                                    <a:hlinkClick r:id="rId16"/>
                                   </pic:cNvPr>
                                   <pic:cNvPicPr>
                                     <a:picLocks noChangeAspect="1"/>
                                   </pic:cNvPicPr>
                                 </pic:nvPicPr>
                                 <pic:blipFill rotWithShape="1">
-                                  <a:blip r:embed="rId2">
+                                  <a:blip r:embed="rId17">
                                     <a:extLst>
                                       <a:ext uri="{28A0092B-C50C-407E-A947-70E740481C1C}">
                                         <a14:useLocalDpi xmlns:a14="http://schemas.microsoft.com/office/drawing/2010/main" val="0"/>
@@ -4374,7 +5771,7 @@
                           <wp:extent cx="180000" cy="180000"/>
                           <wp:effectExtent l="0" t="0" r="0" b="0"/>
                           <wp:docPr id="1307508169" name="Picture 1307508169">
-                            <a:hlinkClick xmlns:a="http://schemas.openxmlformats.org/drawingml/2006/main" r:id="rId4"/>
+                            <a:hlinkClick xmlns:a="http://schemas.openxmlformats.org/drawingml/2006/main" r:id="rId18"/>
                           </wp:docPr>
                           <wp:cNvGraphicFramePr>
                             <a:graphicFrameLocks xmlns:a="http://schemas.openxmlformats.org/drawingml/2006/main" noChangeAspect="1"/>
@@ -4384,14 +5781,14 @@
                               <pic:pic xmlns:pic="http://schemas.openxmlformats.org/drawingml/2006/picture">
                                 <pic:nvPicPr>
                                   <pic:cNvPr id="1307508169" name="Picture 1307508169">
-                                    <a:hlinkClick r:id="rId4"/>
+                                    <a:hlinkClick r:id="rId18"/>
                                   </pic:cNvPr>
                                   <pic:cNvPicPr>
                                     <a:picLocks noChangeAspect="1" noChangeArrowheads="1"/>
                                   </pic:cNvPicPr>
                                 </pic:nvPicPr>
                                 <pic:blipFill>
-                                  <a:blip r:embed="rId5">
+                                  <a:blip r:embed="rId19">
                                     <a:extLst>
                                       <a:ext uri="{28A0092B-C50C-407E-A947-70E740481C1C}">
                                         <a14:useLocalDpi xmlns:a14="http://schemas.microsoft.com/office/drawing/2010/main" val="0"/>
@@ -4447,7 +5844,7 @@
                           <wp:extent cx="180000" cy="180000"/>
                           <wp:effectExtent l="0" t="0" r="0" b="0"/>
                           <wp:docPr id="855318076" name="Picture 855318076" title="Software University @ Facebook">
-                            <a:hlinkClick xmlns:a="http://schemas.openxmlformats.org/drawingml/2006/main" r:id="rId6"/>
+                            <a:hlinkClick xmlns:a="http://schemas.openxmlformats.org/drawingml/2006/main" r:id="rId20"/>
                           </wp:docPr>
                           <wp:cNvGraphicFramePr>
                             <a:graphicFrameLocks xmlns:a="http://schemas.openxmlformats.org/drawingml/2006/main" noChangeAspect="1"/>
@@ -4457,12 +5854,12 @@
                               <pic:pic xmlns:pic="http://schemas.openxmlformats.org/drawingml/2006/picture">
                                 <pic:nvPicPr>
                                   <pic:cNvPr id="855318076" name="Picture 855318076" title="Software University @ Facebook">
-                                    <a:hlinkClick r:id="rId6"/>
+                                    <a:hlinkClick r:id="rId20"/>
                                   </pic:cNvPr>
                                   <pic:cNvPicPr/>
                                 </pic:nvPicPr>
                                 <pic:blipFill>
-                                  <a:blip r:embed="rId7"/>
+                                  <a:blip r:embed="rId21"/>
                                   <a:stretch>
                                     <a:fillRect/>
                                   </a:stretch>
@@ -4500,7 +5897,7 @@
                           <wp:extent cx="180000" cy="180000"/>
                           <wp:effectExtent l="0" t="0" r="0" b="0"/>
                           <wp:docPr id="1316759338" name="Picture 1316759338">
-                            <a:hlinkClick xmlns:a="http://schemas.openxmlformats.org/drawingml/2006/main" r:id="rId8"/>
+                            <a:hlinkClick xmlns:a="http://schemas.openxmlformats.org/drawingml/2006/main" r:id="rId22"/>
                           </wp:docPr>
                           <wp:cNvGraphicFramePr>
                             <a:graphicFrameLocks xmlns:a="http://schemas.openxmlformats.org/drawingml/2006/main" noChangeAspect="1"/>
@@ -4510,20 +5907,20 @@
                               <pic:pic xmlns:pic="http://schemas.openxmlformats.org/drawingml/2006/picture">
                                 <pic:nvPicPr>
                                   <pic:cNvPr id="1316759338" name="Picture 1316759338">
-                                    <a:hlinkClick r:id="rId8"/>
+                                    <a:hlinkClick r:id="rId22"/>
                                   </pic:cNvPr>
                                   <pic:cNvPicPr>
                                     <a:picLocks noChangeAspect="1" noChangeArrowheads="1"/>
                                   </pic:cNvPicPr>
                                 </pic:nvPicPr>
                                 <pic:blipFill>
-                                  <a:blip r:embed="rId9">
+                                  <a:blip r:embed="rId23">
                                     <a:extLst>
                                       <a:ext uri="{28A0092B-C50C-407E-A947-70E740481C1C}">
                                         <a14:useLocalDpi xmlns:a14="http://schemas.microsoft.com/office/drawing/2010/main" val="0"/>
                                       </a:ext>
                                       <a:ext uri="{837473B0-CC2E-450A-ABE3-18F120FF3D39}">
-                                        <a1611:picAttrSrcUrl xmlns:a1611="http://schemas.microsoft.com/office/drawing/2016/11/main" xmlns:w16sdtfl="http://schemas.microsoft.com/office/word/2024/wordml/sdtformatlock" xmlns:w16sdtdh="http://schemas.microsoft.com/office/word/2020/wordml/sdtdatahash" xmlns:w16du="http://schemas.microsoft.com/office/word/2023/wordml/word16du" xmlns:w16="http://schemas.microsoft.com/office/word/2018/wordml" xmlns:w16cid="http://schemas.microsoft.com/office/word/2016/wordml/cid" xmlns:w16cex="http://schemas.microsoft.com/office/word/2018/wordml/cex" xmlns:w="http://schemas.openxmlformats.org/wordprocessingml/2006/main" xmlns:w10="urn:schemas-microsoft-com:office:word" xmlns:v="urn:schemas-microsoft-com:vml" xmlns:oel="http://schemas.microsoft.com/office/2019/extlst" xmlns:o="urn:schemas-microsoft-com:office:office" xmlns:am3d="http://schemas.microsoft.com/office/drawing/2017/model3d" xmlns:aink="http://schemas.microsoft.com/office/drawing/2016/ink" xmlns:cx8="http://schemas.microsoft.com/office/drawing/2016/5/14/chartex" xmlns:cx7="http://schemas.microsoft.com/office/drawing/2016/5/13/chartex" xmlns:cx6="http://schemas.microsoft.com/office/drawing/2016/5/12/chartex" xmlns:cx5="http://schemas.microsoft.com/office/drawing/2016/5/11/chartex" xmlns:cx4="http://schemas.microsoft.com/office/drawing/2016/5/10/chartex" xmlns:cx3="http://schemas.microsoft.com/office/drawing/2016/5/9/chartex" xmlns:cx2="http://schemas.microsoft.com/office/drawing/2015/10/21/chartex" xmlns:cx1="http://schemas.microsoft.com/office/drawing/2015/9/8/chartex" xmlns="" r:id="rId10"/>
+                                        <a1611:picAttrSrcUrl xmlns="" xmlns:cx1="http://schemas.microsoft.com/office/drawing/2015/9/8/chartex" xmlns:cx2="http://schemas.microsoft.com/office/drawing/2015/10/21/chartex" xmlns:cx3="http://schemas.microsoft.com/office/drawing/2016/5/9/chartex" xmlns:cx4="http://schemas.microsoft.com/office/drawing/2016/5/10/chartex" xmlns:cx5="http://schemas.microsoft.com/office/drawing/2016/5/11/chartex" xmlns:cx6="http://schemas.microsoft.com/office/drawing/2016/5/12/chartex" xmlns:cx7="http://schemas.microsoft.com/office/drawing/2016/5/13/chartex" xmlns:cx8="http://schemas.microsoft.com/office/drawing/2016/5/14/chartex" xmlns:aink="http://schemas.microsoft.com/office/drawing/2016/ink" xmlns:am3d="http://schemas.microsoft.com/office/drawing/2017/model3d" xmlns:o="urn:schemas-microsoft-com:office:office" xmlns:oel="http://schemas.microsoft.com/office/2019/extlst" xmlns:v="urn:schemas-microsoft-com:vml" xmlns:w10="urn:schemas-microsoft-com:office:word" xmlns:w="http://schemas.openxmlformats.org/wordprocessingml/2006/main" xmlns:w16cex="http://schemas.microsoft.com/office/word/2018/wordml/cex" xmlns:w16cid="http://schemas.microsoft.com/office/word/2016/wordml/cid" xmlns:w16="http://schemas.microsoft.com/office/word/2018/wordml" xmlns:w16du="http://schemas.microsoft.com/office/word/2023/wordml/word16du" xmlns:w16sdtdh="http://schemas.microsoft.com/office/word/2020/wordml/sdtdatahash" xmlns:w16sdtfl="http://schemas.microsoft.com/office/word/2024/wordml/sdtformatlock" xmlns:a1611="http://schemas.microsoft.com/office/drawing/2016/11/main" r:id="rId10"/>
                                       </a:ext>
                                     </a:extLst>
                                   </a:blip>
@@ -4569,7 +5966,7 @@
                           <wp:extent cx="180000" cy="180000"/>
                           <wp:effectExtent l="0" t="0" r="0" b="0"/>
                           <wp:docPr id="1792062894" name="Picture 1792062894" title="Software University @ YouTube">
-                            <a:hlinkClick xmlns:a="http://schemas.openxmlformats.org/drawingml/2006/main" r:id="rId11"/>
+                            <a:hlinkClick xmlns:a="http://schemas.openxmlformats.org/drawingml/2006/main" r:id="rId24"/>
                           </wp:docPr>
                           <wp:cNvGraphicFramePr>
                             <a:graphicFrameLocks xmlns:a="http://schemas.openxmlformats.org/drawingml/2006/main" noChangeAspect="1"/>
@@ -4579,12 +5976,12 @@
                               <pic:pic xmlns:pic="http://schemas.openxmlformats.org/drawingml/2006/picture">
                                 <pic:nvPicPr>
                                   <pic:cNvPr id="1792062894" name="Picture 1792062894" title="Software University @ YouTube">
-                                    <a:hlinkClick r:id="rId11"/>
+                                    <a:hlinkClick r:id="rId24"/>
                                   </pic:cNvPr>
                                   <pic:cNvPicPr/>
                                 </pic:nvPicPr>
                                 <pic:blipFill>
-                                  <a:blip r:embed="rId12"/>
+                                  <a:blip r:embed="rId25"/>
                                   <a:stretch>
                                     <a:fillRect/>
                                   </a:stretch>
@@ -4622,7 +6019,7 @@
                           <wp:extent cx="180000" cy="180000"/>
                           <wp:effectExtent l="0" t="0" r="0" b="0"/>
                           <wp:docPr id="873394414" name="Picture 873394414">
-                            <a:hlinkClick xmlns:a="http://schemas.openxmlformats.org/drawingml/2006/main" r:id="rId13"/>
+                            <a:hlinkClick xmlns:a="http://schemas.openxmlformats.org/drawingml/2006/main" r:id="rId26"/>
                           </wp:docPr>
                           <wp:cNvGraphicFramePr>
                             <a:graphicFrameLocks xmlns:a="http://schemas.openxmlformats.org/drawingml/2006/main" noChangeAspect="1"/>
@@ -4632,14 +6029,14 @@
                               <pic:pic xmlns:pic="http://schemas.openxmlformats.org/drawingml/2006/picture">
                                 <pic:nvPicPr>
                                   <pic:cNvPr id="873394414" name="Picture 873394414">
-                                    <a:hlinkClick r:id="rId13"/>
+                                    <a:hlinkClick r:id="rId26"/>
                                   </pic:cNvPr>
                                   <pic:cNvPicPr>
                                     <a:picLocks noChangeAspect="1" noChangeArrowheads="1"/>
                                   </pic:cNvPicPr>
                                 </pic:nvPicPr>
                                 <pic:blipFill rotWithShape="1">
-                                  <a:blip r:embed="rId14">
+                                  <a:blip r:embed="rId27">
                                     <a:extLst>
                                       <a:ext uri="{28A0092B-C50C-407E-A947-70E740481C1C}">
                                         <a14:useLocalDpi xmlns:a14="http://schemas.microsoft.com/office/drawing/2010/main" val="0"/>
@@ -4793,7 +6190,7 @@
                               <w:sz w:val="18"/>
                               <w:szCs w:val="18"/>
                             </w:rPr>
-                            <w:t>3</w:t>
+                            <w:t>4</w:t>
                           </w:r>
                           <w:r>
                             <w:rPr>
@@ -4851,7 +6248,7 @@
                               <w:sz w:val="18"/>
                               <w:szCs w:val="18"/>
                             </w:rPr>
-                            <w:t>3</w:t>
+                            <w:t>4</w:t>
                           </w:r>
                           <w:r>
                             <w:rPr>
@@ -4883,7 +6280,11 @@
         </mc:Choice>
         <mc:Fallback>
           <w:pict>
-            <v:shape w14:anchorId="60DB5C39" id="Text Box 4" o:spid="_x0000_s1028" type="#_x0000_t202" style="position:absolute;margin-left:444.65pt;margin-top:26.95pt;width:70.9pt;height:15.9pt;z-index:251663360;visibility:visible;mso-wrap-style:square;mso-width-percent:0;mso-height-percent:0;mso-wrap-distance-left:9pt;mso-wrap-distance-top:0;mso-wrap-distance-right:9pt;mso-wrap-distance-bottom:0;mso-position-horizontal:absolute;mso-position-horizontal-relative:text;mso-position-vertical:absolute;mso-position-vertical-relative:text;mso-width-percent:0;mso-height-percent:0;mso-width-relative:page;mso-height-relative:page;v-text-anchor:middle" o:gfxdata="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" filled="f" stroked="f" strokeweight=".5pt">
+            <v:shapetype w14:anchorId="60DB5C39" id="_x0000_t202" coordsize="21600,21600" o:spt="202" path="m,l,21600r21600,l21600,xe">
+              <v:stroke joinstyle="miter"/>
+              <v:path gradientshapeok="t" o:connecttype="rect"/>
+            </v:shapetype>
+            <v:shape id="Text Box 4" o:spid="_x0000_s1028" type="#_x0000_t202" style="position:absolute;margin-left:444.65pt;margin-top:26.95pt;width:70.9pt;height:15.9pt;z-index:251663360;visibility:visible;mso-wrap-style:square;mso-width-percent:0;mso-height-percent:0;mso-wrap-distance-left:9pt;mso-wrap-distance-top:0;mso-wrap-distance-right:9pt;mso-wrap-distance-bottom:0;mso-position-horizontal:absolute;mso-position-horizontal-relative:text;mso-position-vertical:absolute;mso-position-vertical-relative:text;mso-width-percent:0;mso-height-percent:0;mso-width-relative:page;mso-height-relative:page;v-text-anchor:middle" o:gfxdata="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" filled="f" stroked="f" strokeweight=".5pt">
               <v:textbox inset="0,0,0,0">
                 <w:txbxContent>
                   <w:p>
@@ -4937,7 +6338,7 @@
                         <w:sz w:val="18"/>
                         <w:szCs w:val="18"/>
                       </w:rPr>
-                      <w:t>3</w:t>
+                      <w:t>4</w:t>
                     </w:r>
                     <w:r>
                       <w:rPr>
@@ -4995,7 +6396,7 @@
                         <w:sz w:val="18"/>
                         <w:szCs w:val="18"/>
                       </w:rPr>
-                      <w:t>3</w:t>
+                      <w:t>4</w:t>
                     </w:r>
                     <w:r>
                       <w:rPr>
@@ -5368,6 +6769,119 @@
     </w:lvl>
   </w:abstractNum>
   <w:abstractNum w:abstractNumId="3" w15:restartNumberingAfterBreak="0">
+    <w:nsid w:val="16044A06"/>
+    <w:multiLevelType w:val="hybridMultilevel"/>
+    <w:tmpl w:val="FDBCDD46"/>
+    <w:lvl w:ilvl="0" w:tplc="04020001">
+      <w:start w:val="1"/>
+      <w:numFmt w:val="bullet"/>
+      <w:lvlText w:val=""/>
+      <w:lvlJc w:val="left"/>
+      <w:pPr>
+        <w:ind w:left="720" w:hanging="360"/>
+      </w:pPr>
+      <w:rPr>
+        <w:rFonts w:ascii="Symbol" w:hAnsi="Symbol" w:hint="default"/>
+      </w:rPr>
+    </w:lvl>
+    <w:lvl w:ilvl="1" w:tplc="04020003" w:tentative="1">
+      <w:start w:val="1"/>
+      <w:numFmt w:val="bullet"/>
+      <w:lvlText w:val="o"/>
+      <w:lvlJc w:val="left"/>
+      <w:pPr>
+        <w:ind w:left="1440" w:hanging="360"/>
+      </w:pPr>
+      <w:rPr>
+        <w:rFonts w:ascii="Courier New" w:hAnsi="Courier New" w:cs="Courier New" w:hint="default"/>
+      </w:rPr>
+    </w:lvl>
+    <w:lvl w:ilvl="2" w:tplc="04020005" w:tentative="1">
+      <w:start w:val="1"/>
+      <w:numFmt w:val="bullet"/>
+      <w:lvlText w:val=""/>
+      <w:lvlJc w:val="left"/>
+      <w:pPr>
+        <w:ind w:left="2160" w:hanging="360"/>
+      </w:pPr>
+      <w:rPr>
+        <w:rFonts w:ascii="Wingdings" w:hAnsi="Wingdings" w:hint="default"/>
+      </w:rPr>
+    </w:lvl>
+    <w:lvl w:ilvl="3" w:tplc="04020001" w:tentative="1">
+      <w:start w:val="1"/>
+      <w:numFmt w:val="bullet"/>
+      <w:lvlText w:val=""/>
+      <w:lvlJc w:val="left"/>
+      <w:pPr>
+        <w:ind w:left="2880" w:hanging="360"/>
+      </w:pPr>
+      <w:rPr>
+        <w:rFonts w:ascii="Symbol" w:hAnsi="Symbol" w:hint="default"/>
+      </w:rPr>
+    </w:lvl>
+    <w:lvl w:ilvl="4" w:tplc="04020003" w:tentative="1">
+      <w:start w:val="1"/>
+      <w:numFmt w:val="bullet"/>
+      <w:lvlText w:val="o"/>
+      <w:lvlJc w:val="left"/>
+      <w:pPr>
+        <w:ind w:left="3600" w:hanging="360"/>
+      </w:pPr>
+      <w:rPr>
+        <w:rFonts w:ascii="Courier New" w:hAnsi="Courier New" w:cs="Courier New" w:hint="default"/>
+      </w:rPr>
+    </w:lvl>
+    <w:lvl w:ilvl="5" w:tplc="04020005" w:tentative="1">
+      <w:start w:val="1"/>
+      <w:numFmt w:val="bullet"/>
+      <w:lvlText w:val=""/>
+      <w:lvlJc w:val="left"/>
+      <w:pPr>
+        <w:ind w:left="4320" w:hanging="360"/>
+      </w:pPr>
+      <w:rPr>
+        <w:rFonts w:ascii="Wingdings" w:hAnsi="Wingdings" w:hint="default"/>
+      </w:rPr>
+    </w:lvl>
+    <w:lvl w:ilvl="6" w:tplc="04020001" w:tentative="1">
+      <w:start w:val="1"/>
+      <w:numFmt w:val="bullet"/>
+      <w:lvlText w:val=""/>
+      <w:lvlJc w:val="left"/>
+      <w:pPr>
+        <w:ind w:left="5040" w:hanging="360"/>
+      </w:pPr>
+      <w:rPr>
+        <w:rFonts w:ascii="Symbol" w:hAnsi="Symbol" w:hint="default"/>
+      </w:rPr>
+    </w:lvl>
+    <w:lvl w:ilvl="7" w:tplc="04020003" w:tentative="1">
+      <w:start w:val="1"/>
+      <w:numFmt w:val="bullet"/>
+      <w:lvlText w:val="o"/>
+      <w:lvlJc w:val="left"/>
+      <w:pPr>
+        <w:ind w:left="5760" w:hanging="360"/>
+      </w:pPr>
+      <w:rPr>
+        <w:rFonts w:ascii="Courier New" w:hAnsi="Courier New" w:cs="Courier New" w:hint="default"/>
+      </w:rPr>
+    </w:lvl>
+    <w:lvl w:ilvl="8" w:tplc="04020005" w:tentative="1">
+      <w:start w:val="1"/>
+      <w:numFmt w:val="bullet"/>
+      <w:lvlText w:val=""/>
+      <w:lvlJc w:val="left"/>
+      <w:pPr>
+        <w:ind w:left="6480" w:hanging="360"/>
+      </w:pPr>
+      <w:rPr>
+        <w:rFonts w:ascii="Wingdings" w:hAnsi="Wingdings" w:hint="default"/>
+      </w:rPr>
+    </w:lvl>
+  </w:abstractNum>
+  <w:abstractNum w:abstractNumId="4" w15:restartNumberingAfterBreak="0">
     <w:nsid w:val="20EA5969"/>
     <w:multiLevelType w:val="hybridMultilevel"/>
     <w:tmpl w:val="C4DCE606"/>
@@ -5383,7 +6897,7 @@
         <w:rFonts w:ascii="Symbol" w:hAnsi="Symbol" w:hint="default"/>
       </w:rPr>
     </w:lvl>
-    <w:lvl w:ilvl="1" w:tplc="04020003" w:tentative="1">
+    <w:lvl w:ilvl="1" w:tplc="04020003">
       <w:start w:val="1"/>
       <w:numFmt w:val="bullet"/>
       <w:lvlText w:val="o"/>
@@ -5480,7 +6994,7 @@
       </w:rPr>
     </w:lvl>
   </w:abstractNum>
-  <w:abstractNum w:abstractNumId="4" w15:restartNumberingAfterBreak="0">
+  <w:abstractNum w:abstractNumId="5" w15:restartNumberingAfterBreak="0">
     <w:nsid w:val="2AD02CA5"/>
     <w:multiLevelType w:val="hybridMultilevel"/>
     <w:tmpl w:val="FB661938"/>
@@ -5496,7 +7010,7 @@
         <w:rFonts w:ascii="Symbol" w:hAnsi="Symbol" w:hint="default"/>
       </w:rPr>
     </w:lvl>
-    <w:lvl w:ilvl="1" w:tplc="04020003" w:tentative="1">
+    <w:lvl w:ilvl="1" w:tplc="04020003">
       <w:start w:val="1"/>
       <w:numFmt w:val="bullet"/>
       <w:lvlText w:val="o"/>
@@ -5593,7 +7107,7 @@
       </w:rPr>
     </w:lvl>
   </w:abstractNum>
-  <w:abstractNum w:abstractNumId="5" w15:restartNumberingAfterBreak="0">
+  <w:abstractNum w:abstractNumId="6" w15:restartNumberingAfterBreak="0">
     <w:nsid w:val="37CB34FF"/>
     <w:multiLevelType w:val="hybridMultilevel"/>
     <w:tmpl w:val="C2968CD0"/>
@@ -5706,7 +7220,7 @@
       </w:rPr>
     </w:lvl>
   </w:abstractNum>
-  <w:abstractNum w:abstractNumId="6" w15:restartNumberingAfterBreak="0">
+  <w:abstractNum w:abstractNumId="7" w15:restartNumberingAfterBreak="0">
     <w:nsid w:val="3D4E1B32"/>
     <w:multiLevelType w:val="hybridMultilevel"/>
     <w:tmpl w:val="E1226952"/>
@@ -5819,7 +7333,7 @@
       </w:rPr>
     </w:lvl>
   </w:abstractNum>
-  <w:abstractNum w:abstractNumId="7" w15:restartNumberingAfterBreak="0">
+  <w:abstractNum w:abstractNumId="8" w15:restartNumberingAfterBreak="0">
     <w:nsid w:val="41191333"/>
     <w:multiLevelType w:val="hybridMultilevel"/>
     <w:tmpl w:val="6DE08E8A"/>
@@ -5835,7 +7349,7 @@
         <w:rFonts w:ascii="Symbol" w:hAnsi="Symbol" w:hint="default"/>
       </w:rPr>
     </w:lvl>
-    <w:lvl w:ilvl="1" w:tplc="04020003" w:tentative="1">
+    <w:lvl w:ilvl="1" w:tplc="04020003">
       <w:start w:val="1"/>
       <w:numFmt w:val="bullet"/>
       <w:lvlText w:val="o"/>
@@ -5932,7 +7446,7 @@
       </w:rPr>
     </w:lvl>
   </w:abstractNum>
-  <w:abstractNum w:abstractNumId="8" w15:restartNumberingAfterBreak="0">
+  <w:abstractNum w:abstractNumId="9" w15:restartNumberingAfterBreak="0">
     <w:nsid w:val="451F047E"/>
     <w:multiLevelType w:val="hybridMultilevel"/>
     <w:tmpl w:val="0B0E6668"/>
@@ -6045,7 +7559,7 @@
       </w:rPr>
     </w:lvl>
   </w:abstractNum>
-  <w:abstractNum w:abstractNumId="9" w15:restartNumberingAfterBreak="0">
+  <w:abstractNum w:abstractNumId="10" w15:restartNumberingAfterBreak="0">
     <w:nsid w:val="52530576"/>
     <w:multiLevelType w:val="hybridMultilevel"/>
     <w:tmpl w:val="3F425980"/>
@@ -6158,7 +7672,7 @@
       </w:rPr>
     </w:lvl>
   </w:abstractNum>
-  <w:abstractNum w:abstractNumId="10" w15:restartNumberingAfterBreak="0">
+  <w:abstractNum w:abstractNumId="11" w15:restartNumberingAfterBreak="0">
     <w:nsid w:val="5F160D04"/>
     <w:multiLevelType w:val="hybridMultilevel"/>
     <w:tmpl w:val="F1FC0DA8"/>
@@ -6271,7 +7785,7 @@
       </w:rPr>
     </w:lvl>
   </w:abstractNum>
-  <w:abstractNum w:abstractNumId="11" w15:restartNumberingAfterBreak="0">
+  <w:abstractNum w:abstractNumId="12" w15:restartNumberingAfterBreak="0">
     <w:nsid w:val="63A21296"/>
     <w:multiLevelType w:val="hybridMultilevel"/>
     <w:tmpl w:val="9558CC14"/>
@@ -6384,7 +7898,7 @@
       </w:rPr>
     </w:lvl>
   </w:abstractNum>
-  <w:abstractNum w:abstractNumId="12" w15:restartNumberingAfterBreak="0">
+  <w:abstractNum w:abstractNumId="13" w15:restartNumberingAfterBreak="0">
     <w:nsid w:val="7EC067BB"/>
     <w:multiLevelType w:val="hybridMultilevel"/>
     <w:tmpl w:val="6C28BD94"/>
@@ -6501,42 +8015,45 @@
     <w:abstractNumId w:val="1"/>
   </w:num>
   <w:num w:numId="2">
-    <w:abstractNumId w:val="11"/>
+    <w:abstractNumId w:val="12"/>
   </w:num>
   <w:num w:numId="3">
-    <w:abstractNumId w:val="3"/>
+    <w:abstractNumId w:val="4"/>
   </w:num>
   <w:num w:numId="4">
-    <w:abstractNumId w:val="12"/>
+    <w:abstractNumId w:val="13"/>
   </w:num>
   <w:num w:numId="5">
     <w:abstractNumId w:val="2"/>
   </w:num>
   <w:num w:numId="6">
-    <w:abstractNumId w:val="4"/>
+    <w:abstractNumId w:val="5"/>
   </w:num>
   <w:num w:numId="7">
     <w:abstractNumId w:val="0"/>
   </w:num>
   <w:num w:numId="8">
-    <w:abstractNumId w:val="5"/>
+    <w:abstractNumId w:val="6"/>
   </w:num>
   <w:num w:numId="9">
+    <w:abstractNumId w:val="11"/>
+  </w:num>
+  <w:num w:numId="10">
+    <w:abstractNumId w:val="8"/>
+  </w:num>
+  <w:num w:numId="11">
+    <w:abstractNumId w:val="7"/>
+  </w:num>
+  <w:num w:numId="12">
     <w:abstractNumId w:val="10"/>
   </w:num>
-  <w:num w:numId="10">
-    <w:abstractNumId w:val="7"/>
-  </w:num>
-  <w:num w:numId="11">
-    <w:abstractNumId w:val="6"/>
-  </w:num>
-  <w:num w:numId="12">
+  <w:num w:numId="13">
     <w:abstractNumId w:val="9"/>
   </w:num>
-  <w:num w:numId="13">
-    <w:abstractNumId w:val="8"/>
+  <w:num w:numId="14">
+    <w:abstractNumId w:val="3"/>
   </w:num>
-  <w:numIdMacAtCleanup w:val="13"/>
+  <w:numIdMacAtCleanup w:val="14"/>
 </w:numbering>
 </file>
 
@@ -7057,6 +8574,7 @@
   <w:style w:type="character" w:default="1" w:styleId="a0">
     <w:name w:val="Default Paragraph Font"/>
     <w:uiPriority w:val="1"/>
+    <w:semiHidden/>
     <w:unhideWhenUsed/>
   </w:style>
   <w:style w:type="table" w:default="1" w:styleId="a1">
@@ -7683,7 +9201,7 @@
 </file>
 
 <file path=customXml/itemProps1.xml><?xml version="1.0" encoding="utf-8"?>
-<ds:datastoreItem xmlns:ds="http://schemas.openxmlformats.org/officeDocument/2006/customXml" ds:itemID="{4F117D56-461B-4C29-A191-BA9A877E91F7}">
+<ds:datastoreItem xmlns:ds="http://schemas.openxmlformats.org/officeDocument/2006/customXml" ds:itemID="{BFE80AC5-E2D5-49FC-B8FD-E0871AD048AB}">
   <ds:schemaRefs>
     <ds:schemaRef ds:uri="http://schemas.openxmlformats.org/officeDocument/2006/bibliography"/>
   </ds:schemaRefs>

</xml_diff>